<commit_message>
docs: independent review results, new settings, queue and auto-shift rules
- Revision report: "Найдено независимой проверкой 0.2" — the server and
  editor findings with severity and fixes.
- ADR-0002: plan lock re-read, per-edit queue with isolation, background
  sending after closing a plan, safe resend, late poll guard, local
  auto-shift; ADR-0003: per-account login limit, LOGIN_IP_RATE_LIMIT,
  TRUSTED_PROXY_HOPS, LDAP never links a local admin, short anonymous
  sessions.
- Guides, README, versions_admin, CHANGELOG, release notes updated;
  DOCX/PDF rebuilt.
</commit_message>
<xml_diff>
--- a/docs/manuals/admin-guide.docx
+++ b/docs/manuals/admin-guide.docx
@@ -93,7 +93,7 @@
             </w:rPr>
             <w:fldChar w:fldCharType="separate"/>
           </w:r>
-          <w:hyperlink w:anchor="__RefHeading___Toc890_3593341042">
+          <w:hyperlink w:anchor="__RefHeading___Toc894_2869646815">
             <w:r>
               <w:rPr>
                 <w:webHidden/>
@@ -114,7 +114,7 @@
             </w:tabs>
             <w:rPr/>
           </w:pPr>
-          <w:hyperlink w:anchor="__RefHeading___Toc892_3593341042">
+          <w:hyperlink w:anchor="__RefHeading___Toc896_2869646815">
             <w:r>
               <w:rPr>
                 <w:webHidden/>
@@ -135,7 +135,7 @@
             </w:tabs>
             <w:rPr/>
           </w:pPr>
-          <w:hyperlink w:anchor="__RefHeading___Toc894_3593341042">
+          <w:hyperlink w:anchor="__RefHeading___Toc898_2869646815">
             <w:r>
               <w:rPr>
                 <w:webHidden/>
@@ -156,7 +156,7 @@
             </w:tabs>
             <w:rPr/>
           </w:pPr>
-          <w:hyperlink w:anchor="__RefHeading___Toc896_3593341042">
+          <w:hyperlink w:anchor="__RefHeading___Toc900_2869646815">
             <w:r>
               <w:rPr>
                 <w:webHidden/>
@@ -177,7 +177,7 @@
             </w:tabs>
             <w:rPr/>
           </w:pPr>
-          <w:hyperlink w:anchor="__RefHeading___Toc898_3593341042">
+          <w:hyperlink w:anchor="__RefHeading___Toc902_2869646815">
             <w:r>
               <w:rPr>
                 <w:webHidden/>
@@ -198,7 +198,7 @@
             </w:tabs>
             <w:rPr/>
           </w:pPr>
-          <w:hyperlink w:anchor="__RefHeading___Toc900_3593341042">
+          <w:hyperlink w:anchor="__RefHeading___Toc904_2869646815">
             <w:r>
               <w:rPr>
                 <w:webHidden/>
@@ -219,7 +219,7 @@
             </w:tabs>
             <w:rPr/>
           </w:pPr>
-          <w:hyperlink w:anchor="__RefHeading___Toc902_3593341042">
+          <w:hyperlink w:anchor="__RefHeading___Toc906_2869646815">
             <w:r>
               <w:rPr>
                 <w:webHidden/>
@@ -240,7 +240,7 @@
             </w:tabs>
             <w:rPr/>
           </w:pPr>
-          <w:hyperlink w:anchor="__RefHeading___Toc904_3593341042">
+          <w:hyperlink w:anchor="__RefHeading___Toc908_2869646815">
             <w:r>
               <w:rPr>
                 <w:webHidden/>
@@ -261,7 +261,7 @@
             </w:tabs>
             <w:rPr/>
           </w:pPr>
-          <w:hyperlink w:anchor="__RefHeading___Toc906_3593341042">
+          <w:hyperlink w:anchor="__RefHeading___Toc910_2869646815">
             <w:r>
               <w:rPr>
                 <w:webHidden/>
@@ -282,7 +282,7 @@
             </w:tabs>
             <w:rPr/>
           </w:pPr>
-          <w:hyperlink w:anchor="__RefHeading___Toc908_3593341042">
+          <w:hyperlink w:anchor="__RefHeading___Toc912_2869646815">
             <w:r>
               <w:rPr>
                 <w:webHidden/>
@@ -303,7 +303,7 @@
             </w:tabs>
             <w:rPr/>
           </w:pPr>
-          <w:hyperlink w:anchor="__RefHeading___Toc910_3593341042">
+          <w:hyperlink w:anchor="__RefHeading___Toc914_2869646815">
             <w:r>
               <w:rPr>
                 <w:webHidden/>
@@ -324,7 +324,7 @@
             </w:tabs>
             <w:rPr/>
           </w:pPr>
-          <w:hyperlink w:anchor="__RefHeading___Toc912_3593341042">
+          <w:hyperlink w:anchor="__RefHeading___Toc916_2869646815">
             <w:r>
               <w:rPr>
                 <w:webHidden/>
@@ -345,7 +345,7 @@
             </w:tabs>
             <w:rPr/>
           </w:pPr>
-          <w:hyperlink w:anchor="__RefHeading___Toc914_3593341042">
+          <w:hyperlink w:anchor="__RefHeading___Toc918_2869646815">
             <w:r>
               <w:rPr>
                 <w:webHidden/>
@@ -366,7 +366,7 @@
             </w:tabs>
             <w:rPr/>
           </w:pPr>
-          <w:hyperlink w:anchor="__RefHeading___Toc916_3593341042">
+          <w:hyperlink w:anchor="__RefHeading___Toc920_2869646815">
             <w:r>
               <w:rPr>
                 <w:webHidden/>
@@ -387,7 +387,7 @@
             </w:tabs>
             <w:rPr/>
           </w:pPr>
-          <w:hyperlink w:anchor="__RefHeading___Toc918_3593341042">
+          <w:hyperlink w:anchor="__RefHeading___Toc922_2869646815">
             <w:r>
               <w:rPr>
                 <w:webHidden/>
@@ -408,7 +408,7 @@
             </w:tabs>
             <w:rPr/>
           </w:pPr>
-          <w:hyperlink w:anchor="__RefHeading___Toc920_3593341042">
+          <w:hyperlink w:anchor="__RefHeading___Toc924_2869646815">
             <w:r>
               <w:rPr>
                 <w:webHidden/>
@@ -429,7 +429,7 @@
             </w:tabs>
             <w:rPr/>
           </w:pPr>
-          <w:hyperlink w:anchor="__RefHeading___Toc922_3593341042">
+          <w:hyperlink w:anchor="__RefHeading___Toc926_2869646815">
             <w:r>
               <w:rPr>
                 <w:webHidden/>
@@ -450,7 +450,7 @@
             </w:tabs>
             <w:rPr/>
           </w:pPr>
-          <w:hyperlink w:anchor="__RefHeading___Toc924_3593341042">
+          <w:hyperlink w:anchor="__RefHeading___Toc928_2869646815">
             <w:r>
               <w:rPr>
                 <w:webHidden/>
@@ -471,7 +471,7 @@
             </w:tabs>
             <w:rPr/>
           </w:pPr>
-          <w:hyperlink w:anchor="__RefHeading___Toc926_3593341042">
+          <w:hyperlink w:anchor="__RefHeading___Toc930_2869646815">
             <w:r>
               <w:rPr>
                 <w:webHidden/>
@@ -492,7 +492,7 @@
             </w:tabs>
             <w:rPr/>
           </w:pPr>
-          <w:hyperlink w:anchor="__RefHeading___Toc928_3593341042">
+          <w:hyperlink w:anchor="__RefHeading___Toc932_2869646815">
             <w:r>
               <w:rPr>
                 <w:webHidden/>
@@ -513,7 +513,7 @@
             </w:tabs>
             <w:rPr/>
           </w:pPr>
-          <w:hyperlink w:anchor="__RefHeading___Toc930_3593341042">
+          <w:hyperlink w:anchor="__RefHeading___Toc934_2869646815">
             <w:r>
               <w:rPr>
                 <w:webHidden/>
@@ -534,7 +534,7 @@
             </w:tabs>
             <w:rPr/>
           </w:pPr>
-          <w:hyperlink w:anchor="__RefHeading___Toc932_3593341042">
+          <w:hyperlink w:anchor="__RefHeading___Toc936_2869646815">
             <w:r>
               <w:rPr>
                 <w:webHidden/>
@@ -555,7 +555,7 @@
             </w:tabs>
             <w:rPr/>
           </w:pPr>
-          <w:hyperlink w:anchor="__RefHeading___Toc934_3593341042">
+          <w:hyperlink w:anchor="__RefHeading___Toc938_2869646815">
             <w:r>
               <w:rPr>
                 <w:webHidden/>
@@ -576,7 +576,7 @@
             </w:tabs>
             <w:rPr/>
           </w:pPr>
-          <w:hyperlink w:anchor="__RefHeading___Toc936_3593341042">
+          <w:hyperlink w:anchor="__RefHeading___Toc940_2869646815">
             <w:r>
               <w:rPr>
                 <w:webHidden/>
@@ -597,7 +597,7 @@
             </w:tabs>
             <w:rPr/>
           </w:pPr>
-          <w:hyperlink w:anchor="__RefHeading___Toc938_3593341042">
+          <w:hyperlink w:anchor="__RefHeading___Toc942_2869646815">
             <w:r>
               <w:rPr>
                 <w:webHidden/>
@@ -618,7 +618,7 @@
             </w:tabs>
             <w:rPr/>
           </w:pPr>
-          <w:hyperlink w:anchor="__RefHeading___Toc940_3593341042">
+          <w:hyperlink w:anchor="__RefHeading___Toc944_2869646815">
             <w:r>
               <w:rPr>
                 <w:webHidden/>
@@ -639,7 +639,7 @@
             </w:tabs>
             <w:rPr/>
           </w:pPr>
-          <w:hyperlink w:anchor="__RefHeading___Toc942_3593341042">
+          <w:hyperlink w:anchor="__RefHeading___Toc946_2869646815">
             <w:r>
               <w:rPr>
                 <w:webHidden/>
@@ -660,7 +660,7 @@
             </w:tabs>
             <w:rPr/>
           </w:pPr>
-          <w:hyperlink w:anchor="__RefHeading___Toc944_3593341042">
+          <w:hyperlink w:anchor="__RefHeading___Toc948_2869646815">
             <w:r>
               <w:rPr>
                 <w:webHidden/>
@@ -681,7 +681,7 @@
             </w:tabs>
             <w:rPr/>
           </w:pPr>
-          <w:hyperlink w:anchor="__RefHeading___Toc946_3593341042">
+          <w:hyperlink w:anchor="__RefHeading___Toc950_2869646815">
             <w:r>
               <w:rPr>
                 <w:webHidden/>
@@ -702,7 +702,7 @@
             </w:tabs>
             <w:rPr/>
           </w:pPr>
-          <w:hyperlink w:anchor="__RefHeading___Toc948_3593341042">
+          <w:hyperlink w:anchor="__RefHeading___Toc952_2869646815">
             <w:r>
               <w:rPr>
                 <w:webHidden/>
@@ -723,7 +723,7 @@
             </w:tabs>
             <w:rPr/>
           </w:pPr>
-          <w:hyperlink w:anchor="__RefHeading___Toc950_3593341042">
+          <w:hyperlink w:anchor="__RefHeading___Toc954_2869646815">
             <w:r>
               <w:rPr>
                 <w:webHidden/>
@@ -744,7 +744,7 @@
             </w:tabs>
             <w:rPr/>
           </w:pPr>
-          <w:hyperlink w:anchor="__RefHeading___Toc952_3593341042">
+          <w:hyperlink w:anchor="__RefHeading___Toc956_2869646815">
             <w:r>
               <w:rPr>
                 <w:webHidden/>
@@ -765,7 +765,7 @@
             </w:tabs>
             <w:rPr/>
           </w:pPr>
-          <w:hyperlink w:anchor="__RefHeading___Toc954_3593341042">
+          <w:hyperlink w:anchor="__RefHeading___Toc958_2869646815">
             <w:r>
               <w:rPr>
                 <w:webHidden/>
@@ -786,7 +786,7 @@
             </w:tabs>
             <w:rPr/>
           </w:pPr>
-          <w:hyperlink w:anchor="__RefHeading___Toc956_3593341042">
+          <w:hyperlink w:anchor="__RefHeading___Toc960_2869646815">
             <w:r>
               <w:rPr>
                 <w:webHidden/>
@@ -811,7 +811,7 @@
         <w:pStyle w:val="Heading1"/>
         <w:rPr/>
       </w:pPr>
-      <w:bookmarkStart w:id="0" w:name="__RefHeading___Toc890_3593341042"/>
+      <w:bookmarkStart w:id="0" w:name="__RefHeading___Toc894_2869646815"/>
       <w:bookmarkStart w:id="1" w:name="о-документе"/>
       <w:bookmarkEnd w:id="0"/>
       <w:r>
@@ -853,7 +853,7 @@
         <w:pStyle w:val="Heading1"/>
         <w:rPr/>
       </w:pPr>
-      <w:bookmarkStart w:id="3" w:name="__RefHeading___Toc892_3593341042"/>
+      <w:bookmarkStart w:id="3" w:name="__RefHeading___Toc896_2869646815"/>
       <w:bookmarkStart w:id="4" w:name="роли-и-права"/>
       <w:bookmarkEnd w:id="3"/>
       <w:r>
@@ -873,7 +873,7 @@
         <w:pStyle w:val="Heading2"/>
         <w:rPr/>
       </w:pPr>
-      <w:bookmarkStart w:id="5" w:name="__RefHeading___Toc894_3593341042"/>
+      <w:bookmarkStart w:id="5" w:name="__RefHeading___Toc898_2869646815"/>
       <w:bookmarkEnd w:id="5"/>
       <w:r>
         <w:rPr>
@@ -1287,7 +1287,7 @@
         <w:pStyle w:val="Heading2"/>
         <w:rPr/>
       </w:pPr>
-      <w:bookmarkStart w:id="7" w:name="__RefHeading___Toc896_3593341042"/>
+      <w:bookmarkStart w:id="7" w:name="__RefHeading___Toc900_2869646815"/>
       <w:bookmarkEnd w:id="7"/>
       <w:r>
         <w:rPr>
@@ -1620,7 +1620,7 @@
         <w:pStyle w:val="Heading2"/>
         <w:rPr/>
       </w:pPr>
-      <w:bookmarkStart w:id="8" w:name="__RefHeading___Toc898_3593341042"/>
+      <w:bookmarkStart w:id="8" w:name="__RefHeading___Toc902_2869646815"/>
       <w:bookmarkStart w:id="9" w:name="как-считается-доступ"/>
       <w:bookmarkEnd w:id="8"/>
       <w:r>
@@ -1708,7 +1708,7 @@
         <w:pStyle w:val="Heading2"/>
         <w:rPr/>
       </w:pPr>
-      <w:bookmarkStart w:id="11" w:name="__RefHeading___Toc900_3593341042"/>
+      <w:bookmarkStart w:id="11" w:name="__RefHeading___Toc904_2869646815"/>
       <w:bookmarkStart w:id="12" w:name="защита-от-ошибок"/>
       <w:bookmarkEnd w:id="11"/>
       <w:r>
@@ -1788,7 +1788,7 @@
         <w:pStyle w:val="Heading1"/>
         <w:rPr/>
       </w:pPr>
-      <w:bookmarkStart w:id="15" w:name="__RefHeading___Toc902_3593341042"/>
+      <w:bookmarkStart w:id="15" w:name="__RefHeading___Toc906_2869646815"/>
       <w:bookmarkStart w:id="16" w:name="первичная-настройка"/>
       <w:bookmarkEnd w:id="15"/>
       <w:r>
@@ -1808,7 +1808,7 @@
         <w:pStyle w:val="Heading2"/>
         <w:rPr/>
       </w:pPr>
-      <w:bookmarkStart w:id="17" w:name="__RefHeading___Toc904_3593341042"/>
+      <w:bookmarkStart w:id="17" w:name="__RefHeading___Toc908_2869646815"/>
       <w:bookmarkStart w:id="18" w:name="после-перехода-с-1.0.1"/>
       <w:bookmarkEnd w:id="17"/>
       <w:r>
@@ -1934,7 +1934,7 @@
         <w:pStyle w:val="Heading2"/>
         <w:rPr/>
       </w:pPr>
-      <w:bookmarkStart w:id="19" w:name="__RefHeading___Toc906_3593341042"/>
+      <w:bookmarkStart w:id="19" w:name="__RefHeading___Toc910_2869646815"/>
       <w:bookmarkStart w:id="20" w:name="новая-установка"/>
       <w:bookmarkEnd w:id="19"/>
       <w:r>
@@ -2049,7 +2049,7 @@
         <w:pStyle w:val="Heading1"/>
         <w:rPr/>
       </w:pPr>
-      <w:bookmarkStart w:id="21" w:name="__RefHeading___Toc908_3593341042"/>
+      <w:bookmarkStart w:id="21" w:name="__RefHeading___Toc912_2869646815"/>
       <w:bookmarkStart w:id="22" w:name="сотрудники"/>
       <w:bookmarkEnd w:id="21"/>
       <w:r>
@@ -2069,7 +2069,7 @@
         <w:pStyle w:val="Heading2"/>
         <w:rPr/>
       </w:pPr>
-      <w:bookmarkStart w:id="23" w:name="__RefHeading___Toc910_3593341042"/>
+      <w:bookmarkStart w:id="23" w:name="__RefHeading___Toc914_2869646815"/>
       <w:bookmarkStart w:id="24" w:name="список"/>
       <w:bookmarkEnd w:id="23"/>
       <w:r>
@@ -2167,7 +2167,7 @@
         <w:pStyle w:val="Heading2"/>
         <w:rPr/>
       </w:pPr>
-      <w:bookmarkStart w:id="26" w:name="__RefHeading___Toc912_3593341042"/>
+      <w:bookmarkStart w:id="26" w:name="__RefHeading___Toc916_2869646815"/>
       <w:bookmarkStart w:id="27" w:name="добавление-и-изменение"/>
       <w:bookmarkEnd w:id="26"/>
       <w:r>
@@ -2300,7 +2300,7 @@
         <w:pStyle w:val="Heading2"/>
         <w:rPr/>
       </w:pPr>
-      <w:bookmarkStart w:id="28" w:name="__RefHeading___Toc914_3593341042"/>
+      <w:bookmarkStart w:id="28" w:name="__RefHeading___Toc918_2869646815"/>
       <w:bookmarkStart w:id="29" w:name="отключение-и-удаление"/>
       <w:bookmarkEnd w:id="28"/>
       <w:r>
@@ -2364,7 +2364,7 @@
         <w:pStyle w:val="Heading1"/>
         <w:rPr/>
       </w:pPr>
-      <w:bookmarkStart w:id="30" w:name="__RefHeading___Toc916_3593341042"/>
+      <w:bookmarkStart w:id="30" w:name="__RefHeading___Toc920_2869646815"/>
       <w:bookmarkStart w:id="31" w:name="направления"/>
       <w:bookmarkEnd w:id="30"/>
       <w:r>
@@ -2482,7 +2482,7 @@
         <w:pStyle w:val="Heading1"/>
         <w:rPr/>
       </w:pPr>
-      <w:bookmarkStart w:id="32" w:name="__RefHeading___Toc918_3593341042"/>
+      <w:bookmarkStart w:id="32" w:name="__RefHeading___Toc922_2869646815"/>
       <w:bookmarkStart w:id="33" w:name="доступы"/>
       <w:bookmarkEnd w:id="32"/>
       <w:r>
@@ -2512,7 +2512,7 @@
         <w:pStyle w:val="Heading2"/>
         <w:rPr/>
       </w:pPr>
-      <w:bookmarkStart w:id="34" w:name="__RefHeading___Toc920_3593341042"/>
+      <w:bookmarkStart w:id="34" w:name="__RefHeading___Toc924_2869646815"/>
       <w:bookmarkStart w:id="35" w:name="выдать-доступ"/>
       <w:bookmarkEnd w:id="34"/>
       <w:r>
@@ -2685,7 +2685,7 @@
         <w:pStyle w:val="Heading2"/>
         <w:rPr/>
       </w:pPr>
-      <w:bookmarkStart w:id="37" w:name="__RefHeading___Toc922_3593341042"/>
+      <w:bookmarkStart w:id="37" w:name="__RefHeading___Toc926_2869646815"/>
       <w:bookmarkStart w:id="38" w:name="правила"/>
       <w:bookmarkEnd w:id="37"/>
       <w:r>
@@ -2749,7 +2749,7 @@
         <w:pStyle w:val="Heading2"/>
         <w:rPr/>
       </w:pPr>
-      <w:bookmarkStart w:id="39" w:name="__RefHeading___Toc924_3593341042"/>
+      <w:bookmarkStart w:id="39" w:name="__RefHeading___Toc928_2869646815"/>
       <w:bookmarkStart w:id="40" w:name="кто-что-видит"/>
       <w:bookmarkEnd w:id="39"/>
       <w:r>
@@ -2839,7 +2839,7 @@
         <w:pStyle w:val="Heading1"/>
         <w:rPr/>
       </w:pPr>
-      <w:bookmarkStart w:id="43" w:name="__RefHeading___Toc926_3593341042"/>
+      <w:bookmarkStart w:id="43" w:name="__RefHeading___Toc930_2869646815"/>
       <w:bookmarkStart w:id="44" w:name="реестр-изменений"/>
       <w:bookmarkEnd w:id="43"/>
       <w:r>
@@ -2947,7 +2947,7 @@
         <w:pStyle w:val="Heading1"/>
         <w:rPr/>
       </w:pPr>
-      <w:bookmarkStart w:id="45" w:name="__RefHeading___Toc928_3593341042"/>
+      <w:bookmarkStart w:id="45" w:name="__RefHeading___Toc932_2869646815"/>
       <w:bookmarkStart w:id="46" w:name="корзина"/>
       <w:bookmarkEnd w:id="45"/>
       <w:r>
@@ -3057,7 +3057,7 @@
         <w:pStyle w:val="Heading1"/>
         <w:rPr/>
       </w:pPr>
-      <w:bookmarkStart w:id="48" w:name="__RefHeading___Toc930_3593341042"/>
+      <w:bookmarkStart w:id="48" w:name="__RefHeading___Toc934_2869646815"/>
       <w:bookmarkStart w:id="49" w:name="вход-через-домен"/>
       <w:bookmarkEnd w:id="48"/>
       <w:r>
@@ -4118,7 +4118,7 @@
       <w:bookmarkStart w:id="50" w:name="вход-через-домен"/>
       <w:r>
         <w:rPr/>
-        <w:t>При входе через домен ФИО и email сотрудника обновляются из каталога. Если сотрудник раньше входил по паролю системы, его учётная запись переводится на вход через домен (пароль системы удаляется).</w:t>
+        <w:t>При входе через домен ФИО и email сотрудника обновляются из каталога. Если сотрудник раньше входил по паролю системы, его учётная запись переводится на вход через домен (пароль системы удаляется). Исключение — локальные администраторы: они никогда не связываются с каталогом и всегда входят паролем системы (иначе учётная запись каталога с тем же логином получила бы права администратора).</w:t>
       </w:r>
       <w:bookmarkEnd w:id="50"/>
     </w:p>
@@ -4127,7 +4127,7 @@
         <w:pStyle w:val="Heading1"/>
         <w:rPr/>
       </w:pPr>
-      <w:bookmarkStart w:id="51" w:name="__RefHeading___Toc932_3593341042"/>
+      <w:bookmarkStart w:id="51" w:name="__RefHeading___Toc936_2869646815"/>
       <w:bookmarkStart w:id="52" w:name="производственный-календарь"/>
       <w:bookmarkEnd w:id="51"/>
       <w:r>
@@ -4292,7 +4292,7 @@
         <w:pStyle w:val="Heading1"/>
         <w:rPr/>
       </w:pPr>
-      <w:bookmarkStart w:id="53" w:name="__RefHeading___Toc934_3593341042"/>
+      <w:bookmarkStart w:id="53" w:name="__RefHeading___Toc938_2869646815"/>
       <w:bookmarkStart w:id="54" w:name="работа-сервиса"/>
       <w:bookmarkEnd w:id="53"/>
       <w:r>
@@ -4417,7 +4417,7 @@
         <w:pStyle w:val="Heading1"/>
         <w:rPr/>
       </w:pPr>
-      <w:bookmarkStart w:id="55" w:name="__RefHeading___Toc936_3593341042"/>
+      <w:bookmarkStart w:id="55" w:name="__RefHeading___Toc940_2869646815"/>
       <w:bookmarkStart w:id="56" w:name="сценарии-администратора"/>
       <w:bookmarkEnd w:id="55"/>
       <w:r>
@@ -4437,7 +4437,7 @@
         <w:pStyle w:val="Heading2"/>
         <w:rPr/>
       </w:pPr>
-      <w:bookmarkStart w:id="57" w:name="__RefHeading___Toc938_3593341042"/>
+      <w:bookmarkStart w:id="57" w:name="__RefHeading___Toc942_2869646815"/>
       <w:bookmarkStart w:id="58" w:name="X525cf896d0e0da260fae1e7259530962a7d5ac1"/>
       <w:bookmarkEnd w:id="57"/>
       <w:r>
@@ -4515,7 +4515,7 @@
         <w:pStyle w:val="Heading2"/>
         <w:rPr/>
       </w:pPr>
-      <w:bookmarkStart w:id="60" w:name="__RefHeading___Toc940_3593341042"/>
+      <w:bookmarkStart w:id="60" w:name="__RefHeading___Toc944_2869646815"/>
       <w:bookmarkStart w:id="61" w:name="сценарий-а2.-увольнение"/>
       <w:bookmarkEnd w:id="60"/>
       <w:r>
@@ -4597,7 +4597,7 @@
         <w:pStyle w:val="Heading2"/>
         <w:rPr/>
       </w:pPr>
-      <w:bookmarkStart w:id="63" w:name="__RefHeading___Toc942_3593341042"/>
+      <w:bookmarkStart w:id="63" w:name="__RefHeading___Toc946_2869646815"/>
       <w:bookmarkStart w:id="64" w:name="X40b3630711ad101350b0dd1e981711065e8bd89"/>
       <w:bookmarkEnd w:id="63"/>
       <w:r>
@@ -4629,7 +4629,7 @@
         <w:pStyle w:val="Heading2"/>
         <w:rPr/>
       </w:pPr>
-      <w:bookmarkStart w:id="66" w:name="__RefHeading___Toc944_3593341042"/>
+      <w:bookmarkStart w:id="66" w:name="__RefHeading___Toc948_2869646815"/>
       <w:bookmarkStart w:id="67" w:name="X47b085d6f5d4ae9e2a209044082e45befec994f"/>
       <w:bookmarkEnd w:id="66"/>
       <w:r>
@@ -4667,7 +4667,7 @@
         <w:pStyle w:val="Heading2"/>
         <w:rPr/>
       </w:pPr>
-      <w:bookmarkStart w:id="68" w:name="__RefHeading___Toc946_3593341042"/>
+      <w:bookmarkStart w:id="68" w:name="__RefHeading___Toc950_2869646815"/>
       <w:bookmarkStart w:id="69" w:name="Xe1ad479a47bf9d896db09fa985b7ceb589233e6"/>
       <w:bookmarkEnd w:id="68"/>
       <w:r>
@@ -4738,7 +4738,7 @@
         <w:pStyle w:val="Heading2"/>
         <w:rPr/>
       </w:pPr>
-      <w:bookmarkStart w:id="70" w:name="__RefHeading___Toc948_3593341042"/>
+      <w:bookmarkStart w:id="70" w:name="__RefHeading___Toc952_2869646815"/>
       <w:bookmarkStart w:id="71" w:name="сценарий-а6.-сотрудник-забыл-пароль"/>
       <w:bookmarkEnd w:id="70"/>
       <w:r>
@@ -4791,7 +4791,7 @@
         <w:pStyle w:val="Heading2"/>
         <w:rPr/>
       </w:pPr>
-      <w:bookmarkStart w:id="72" w:name="__RefHeading___Toc950_3593341042"/>
+      <w:bookmarkStart w:id="72" w:name="__RefHeading___Toc954_2869646815"/>
       <w:bookmarkStart w:id="73" w:name="сценарий-а7.-переход-на-вход-через-домен"/>
       <w:bookmarkEnd w:id="72"/>
       <w:r>
@@ -4904,7 +4904,7 @@
         <w:pStyle w:val="Heading2"/>
         <w:rPr/>
       </w:pPr>
-      <w:bookmarkStart w:id="74" w:name="__RefHeading___Toc952_3593341042"/>
+      <w:bookmarkStart w:id="74" w:name="__RefHeading___Toc956_2869646815"/>
       <w:bookmarkStart w:id="75" w:name="сценарий-а8.-кто-удалил-строку-в-плане"/>
       <w:bookmarkEnd w:id="74"/>
       <w:r>
@@ -4958,7 +4958,7 @@
         <w:pStyle w:val="Heading1"/>
         <w:rPr/>
       </w:pPr>
-      <w:bookmarkStart w:id="76" w:name="__RefHeading___Toc954_3593341042"/>
+      <w:bookmarkStart w:id="76" w:name="__RefHeading___Toc958_2869646815"/>
       <w:bookmarkStart w:id="77" w:name="рекомендации-по-безопасности"/>
       <w:bookmarkEnd w:id="76"/>
       <w:r>
@@ -5071,7 +5071,7 @@
         <w:pStyle w:val="Heading1"/>
         <w:rPr/>
       </w:pPr>
-      <w:bookmarkStart w:id="78" w:name="__RefHeading___Toc956_3593341042"/>
+      <w:bookmarkStart w:id="78" w:name="__RefHeading___Toc960_2869646815"/>
       <w:bookmarkStart w:id="79" w:name="частые-вопросы"/>
       <w:bookmarkEnd w:id="78"/>
       <w:r>

</xml_diff>

<commit_message>
docs: manuals for 0.2.1 — new screenshots, DOCX and PDF rebuilt
Screenshots taken on the 0.2.1 interface (232px sidebar, one-line
legend, card «Сроки» block, «Что нового»); the screenshot tool takes
SHOTS_API_PORT/SHOTS_WEB_PORT and starts vite without npx so nothing is
left running.
</commit_message>
<xml_diff>
--- a/docs/manuals/admin-guide.docx
+++ b/docs/manuals/admin-guide.docx
@@ -23,7 +23,7 @@
       </w:pPr>
       <w:r>
         <w:rPr/>
-        <w:t>Версия 0.2.0</w:t>
+        <w:t>Версия 0.2.1</w:t>
       </w:r>
     </w:p>
     <w:p>
@@ -93,7 +93,7 @@
             </w:rPr>
             <w:fldChar w:fldCharType="separate"/>
           </w:r>
-          <w:hyperlink w:anchor="__RefHeading___Toc894_2869646815">
+          <w:hyperlink w:anchor="__RefHeading___Toc925_87357894">
             <w:r>
               <w:rPr>
                 <w:webHidden/>
@@ -114,7 +114,7 @@
             </w:tabs>
             <w:rPr/>
           </w:pPr>
-          <w:hyperlink w:anchor="__RefHeading___Toc896_2869646815">
+          <w:hyperlink w:anchor="__RefHeading___Toc927_87357894">
             <w:r>
               <w:rPr>
                 <w:webHidden/>
@@ -135,7 +135,7 @@
             </w:tabs>
             <w:rPr/>
           </w:pPr>
-          <w:hyperlink w:anchor="__RefHeading___Toc898_2869646815">
+          <w:hyperlink w:anchor="__RefHeading___Toc929_87357894">
             <w:r>
               <w:rPr>
                 <w:webHidden/>
@@ -156,7 +156,7 @@
             </w:tabs>
             <w:rPr/>
           </w:pPr>
-          <w:hyperlink w:anchor="__RefHeading___Toc900_2869646815">
+          <w:hyperlink w:anchor="__RefHeading___Toc931_87357894">
             <w:r>
               <w:rPr>
                 <w:webHidden/>
@@ -177,7 +177,7 @@
             </w:tabs>
             <w:rPr/>
           </w:pPr>
-          <w:hyperlink w:anchor="__RefHeading___Toc902_2869646815">
+          <w:hyperlink w:anchor="__RefHeading___Toc933_87357894">
             <w:r>
               <w:rPr>
                 <w:webHidden/>
@@ -198,7 +198,7 @@
             </w:tabs>
             <w:rPr/>
           </w:pPr>
-          <w:hyperlink w:anchor="__RefHeading___Toc904_2869646815">
+          <w:hyperlink w:anchor="__RefHeading___Toc935_87357894">
             <w:r>
               <w:rPr>
                 <w:webHidden/>
@@ -219,7 +219,7 @@
             </w:tabs>
             <w:rPr/>
           </w:pPr>
-          <w:hyperlink w:anchor="__RefHeading___Toc906_2869646815">
+          <w:hyperlink w:anchor="__RefHeading___Toc937_87357894">
             <w:r>
               <w:rPr>
                 <w:webHidden/>
@@ -240,7 +240,7 @@
             </w:tabs>
             <w:rPr/>
           </w:pPr>
-          <w:hyperlink w:anchor="__RefHeading___Toc908_2869646815">
+          <w:hyperlink w:anchor="__RefHeading___Toc939_87357894">
             <w:r>
               <w:rPr>
                 <w:webHidden/>
@@ -261,7 +261,7 @@
             </w:tabs>
             <w:rPr/>
           </w:pPr>
-          <w:hyperlink w:anchor="__RefHeading___Toc910_2869646815">
+          <w:hyperlink w:anchor="__RefHeading___Toc941_87357894">
             <w:r>
               <w:rPr>
                 <w:webHidden/>
@@ -282,7 +282,7 @@
             </w:tabs>
             <w:rPr/>
           </w:pPr>
-          <w:hyperlink w:anchor="__RefHeading___Toc912_2869646815">
+          <w:hyperlink w:anchor="__RefHeading___Toc943_87357894">
             <w:r>
               <w:rPr>
                 <w:webHidden/>
@@ -303,7 +303,7 @@
             </w:tabs>
             <w:rPr/>
           </w:pPr>
-          <w:hyperlink w:anchor="__RefHeading___Toc914_2869646815">
+          <w:hyperlink w:anchor="__RefHeading___Toc945_87357894">
             <w:r>
               <w:rPr>
                 <w:webHidden/>
@@ -324,7 +324,7 @@
             </w:tabs>
             <w:rPr/>
           </w:pPr>
-          <w:hyperlink w:anchor="__RefHeading___Toc916_2869646815">
+          <w:hyperlink w:anchor="__RefHeading___Toc947_87357894">
             <w:r>
               <w:rPr>
                 <w:webHidden/>
@@ -345,7 +345,7 @@
             </w:tabs>
             <w:rPr/>
           </w:pPr>
-          <w:hyperlink w:anchor="__RefHeading___Toc918_2869646815">
+          <w:hyperlink w:anchor="__RefHeading___Toc949_87357894">
             <w:r>
               <w:rPr>
                 <w:webHidden/>
@@ -366,7 +366,7 @@
             </w:tabs>
             <w:rPr/>
           </w:pPr>
-          <w:hyperlink w:anchor="__RefHeading___Toc920_2869646815">
+          <w:hyperlink w:anchor="__RefHeading___Toc951_87357894">
             <w:r>
               <w:rPr>
                 <w:webHidden/>
@@ -387,7 +387,7 @@
             </w:tabs>
             <w:rPr/>
           </w:pPr>
-          <w:hyperlink w:anchor="__RefHeading___Toc922_2869646815">
+          <w:hyperlink w:anchor="__RefHeading___Toc953_87357894">
             <w:r>
               <w:rPr>
                 <w:webHidden/>
@@ -408,7 +408,7 @@
             </w:tabs>
             <w:rPr/>
           </w:pPr>
-          <w:hyperlink w:anchor="__RefHeading___Toc924_2869646815">
+          <w:hyperlink w:anchor="__RefHeading___Toc955_87357894">
             <w:r>
               <w:rPr>
                 <w:webHidden/>
@@ -429,7 +429,7 @@
             </w:tabs>
             <w:rPr/>
           </w:pPr>
-          <w:hyperlink w:anchor="__RefHeading___Toc926_2869646815">
+          <w:hyperlink w:anchor="__RefHeading___Toc957_87357894">
             <w:r>
               <w:rPr>
                 <w:webHidden/>
@@ -450,7 +450,7 @@
             </w:tabs>
             <w:rPr/>
           </w:pPr>
-          <w:hyperlink w:anchor="__RefHeading___Toc928_2869646815">
+          <w:hyperlink w:anchor="__RefHeading___Toc959_87357894">
             <w:r>
               <w:rPr>
                 <w:webHidden/>
@@ -471,7 +471,7 @@
             </w:tabs>
             <w:rPr/>
           </w:pPr>
-          <w:hyperlink w:anchor="__RefHeading___Toc930_2869646815">
+          <w:hyperlink w:anchor="__RefHeading___Toc961_87357894">
             <w:r>
               <w:rPr>
                 <w:webHidden/>
@@ -492,7 +492,7 @@
             </w:tabs>
             <w:rPr/>
           </w:pPr>
-          <w:hyperlink w:anchor="__RefHeading___Toc932_2869646815">
+          <w:hyperlink w:anchor="__RefHeading___Toc963_87357894">
             <w:r>
               <w:rPr>
                 <w:webHidden/>
@@ -513,7 +513,7 @@
             </w:tabs>
             <w:rPr/>
           </w:pPr>
-          <w:hyperlink w:anchor="__RefHeading___Toc934_2869646815">
+          <w:hyperlink w:anchor="__RefHeading___Toc965_87357894">
             <w:r>
               <w:rPr>
                 <w:webHidden/>
@@ -534,7 +534,7 @@
             </w:tabs>
             <w:rPr/>
           </w:pPr>
-          <w:hyperlink w:anchor="__RefHeading___Toc936_2869646815">
+          <w:hyperlink w:anchor="__RefHeading___Toc967_87357894">
             <w:r>
               <w:rPr>
                 <w:webHidden/>
@@ -555,7 +555,7 @@
             </w:tabs>
             <w:rPr/>
           </w:pPr>
-          <w:hyperlink w:anchor="__RefHeading___Toc938_2869646815">
+          <w:hyperlink w:anchor="__RefHeading___Toc969_87357894">
             <w:r>
               <w:rPr>
                 <w:webHidden/>
@@ -576,7 +576,7 @@
             </w:tabs>
             <w:rPr/>
           </w:pPr>
-          <w:hyperlink w:anchor="__RefHeading___Toc940_2869646815">
+          <w:hyperlink w:anchor="__RefHeading___Toc971_87357894">
             <w:r>
               <w:rPr>
                 <w:webHidden/>
@@ -597,7 +597,7 @@
             </w:tabs>
             <w:rPr/>
           </w:pPr>
-          <w:hyperlink w:anchor="__RefHeading___Toc942_2869646815">
+          <w:hyperlink w:anchor="__RefHeading___Toc973_87357894">
             <w:r>
               <w:rPr>
                 <w:webHidden/>
@@ -618,7 +618,7 @@
             </w:tabs>
             <w:rPr/>
           </w:pPr>
-          <w:hyperlink w:anchor="__RefHeading___Toc944_2869646815">
+          <w:hyperlink w:anchor="__RefHeading___Toc975_87357894">
             <w:r>
               <w:rPr>
                 <w:webHidden/>
@@ -639,7 +639,7 @@
             </w:tabs>
             <w:rPr/>
           </w:pPr>
-          <w:hyperlink w:anchor="__RefHeading___Toc946_2869646815">
+          <w:hyperlink w:anchor="__RefHeading___Toc977_87357894">
             <w:r>
               <w:rPr>
                 <w:webHidden/>
@@ -660,7 +660,7 @@
             </w:tabs>
             <w:rPr/>
           </w:pPr>
-          <w:hyperlink w:anchor="__RefHeading___Toc948_2869646815">
+          <w:hyperlink w:anchor="__RefHeading___Toc979_87357894">
             <w:r>
               <w:rPr>
                 <w:webHidden/>
@@ -681,7 +681,7 @@
             </w:tabs>
             <w:rPr/>
           </w:pPr>
-          <w:hyperlink w:anchor="__RefHeading___Toc950_2869646815">
+          <w:hyperlink w:anchor="__RefHeading___Toc981_87357894">
             <w:r>
               <w:rPr>
                 <w:webHidden/>
@@ -702,7 +702,7 @@
             </w:tabs>
             <w:rPr/>
           </w:pPr>
-          <w:hyperlink w:anchor="__RefHeading___Toc952_2869646815">
+          <w:hyperlink w:anchor="__RefHeading___Toc983_87357894">
             <w:r>
               <w:rPr>
                 <w:webHidden/>
@@ -723,7 +723,7 @@
             </w:tabs>
             <w:rPr/>
           </w:pPr>
-          <w:hyperlink w:anchor="__RefHeading___Toc954_2869646815">
+          <w:hyperlink w:anchor="__RefHeading___Toc985_87357894">
             <w:r>
               <w:rPr>
                 <w:webHidden/>
@@ -744,7 +744,7 @@
             </w:tabs>
             <w:rPr/>
           </w:pPr>
-          <w:hyperlink w:anchor="__RefHeading___Toc956_2869646815">
+          <w:hyperlink w:anchor="__RefHeading___Toc987_87357894">
             <w:r>
               <w:rPr>
                 <w:webHidden/>
@@ -765,7 +765,7 @@
             </w:tabs>
             <w:rPr/>
           </w:pPr>
-          <w:hyperlink w:anchor="__RefHeading___Toc958_2869646815">
+          <w:hyperlink w:anchor="__RefHeading___Toc989_87357894">
             <w:r>
               <w:rPr>
                 <w:webHidden/>
@@ -786,7 +786,7 @@
             </w:tabs>
             <w:rPr/>
           </w:pPr>
-          <w:hyperlink w:anchor="__RefHeading___Toc960_2869646815">
+          <w:hyperlink w:anchor="__RefHeading___Toc991_87357894">
             <w:r>
               <w:rPr>
                 <w:webHidden/>
@@ -811,7 +811,7 @@
         <w:pStyle w:val="Heading1"/>
         <w:rPr/>
       </w:pPr>
-      <w:bookmarkStart w:id="0" w:name="__RefHeading___Toc894_2869646815"/>
+      <w:bookmarkStart w:id="0" w:name="__RefHeading___Toc925_87357894"/>
       <w:bookmarkStart w:id="1" w:name="о-документе"/>
       <w:bookmarkEnd w:id="0"/>
       <w:r>
@@ -833,7 +833,7 @@
       </w:pPr>
       <w:r>
         <w:rPr/>
-        <w:t>Руководство описывает администрирование «Пульса Проекта» версии 0.2.0: роли и доступы, сотрудников, направления, реестр изменений, корзину, вход через домен (LDAP / Active Directory) и производственный календарь. Работа с проектами и планами — в «Руководстве пользователя», установка, обновление и резервное копирование — в «Руководстве по развёртыванию».</w:t>
+        <w:t>Руководство описывает администрирование «Пульса Проекта» версии 0.2.1: роли и доступы, сотрудников, направления, реестр изменений, корзину, вход через домен (LDAP / Active Directory) и производственный календарь. Работа с проектами и планами — в «Руководстве пользователя», установка, обновление и резервное копирование — в «Руководстве по развёртыванию».</w:t>
       </w:r>
     </w:p>
     <w:p>
@@ -853,7 +853,7 @@
         <w:pStyle w:val="Heading1"/>
         <w:rPr/>
       </w:pPr>
-      <w:bookmarkStart w:id="3" w:name="__RefHeading___Toc896_2869646815"/>
+      <w:bookmarkStart w:id="3" w:name="__RefHeading___Toc927_87357894"/>
       <w:bookmarkStart w:id="4" w:name="роли-и-права"/>
       <w:bookmarkEnd w:id="3"/>
       <w:r>
@@ -873,7 +873,7 @@
         <w:pStyle w:val="Heading2"/>
         <w:rPr/>
       </w:pPr>
-      <w:bookmarkStart w:id="5" w:name="__RefHeading___Toc898_2869646815"/>
+      <w:bookmarkStart w:id="5" w:name="__RefHeading___Toc929_87357894"/>
       <w:bookmarkEnd w:id="5"/>
       <w:r>
         <w:rPr>
@@ -1287,7 +1287,7 @@
         <w:pStyle w:val="Heading2"/>
         <w:rPr/>
       </w:pPr>
-      <w:bookmarkStart w:id="7" w:name="__RefHeading___Toc900_2869646815"/>
+      <w:bookmarkStart w:id="7" w:name="__RefHeading___Toc931_87357894"/>
       <w:bookmarkEnd w:id="7"/>
       <w:r>
         <w:rPr>
@@ -1599,7 +1599,7 @@
                 <w:szCs w:val="24"/>
                 <w:lang w:val="ru-RU" w:eastAsia="en-US" w:bidi="ar-SA"/>
               </w:rPr>
-              <w:t>Плюс: переименовывать проект и менять его направление; удалять архивные планы в корзину</w:t>
+              <w:t>Плюс: переименовывать проект и менять его направление; удалять планы в корзину и возвращать их оттуда</w:t>
             </w:r>
           </w:p>
         </w:tc>
@@ -1620,7 +1620,7 @@
         <w:pStyle w:val="Heading2"/>
         <w:rPr/>
       </w:pPr>
-      <w:bookmarkStart w:id="8" w:name="__RefHeading___Toc902_2869646815"/>
+      <w:bookmarkStart w:id="8" w:name="__RefHeading___Toc933_87357894"/>
       <w:bookmarkStart w:id="9" w:name="как-считается-доступ"/>
       <w:bookmarkEnd w:id="8"/>
       <w:r>
@@ -1708,7 +1708,7 @@
         <w:pStyle w:val="Heading2"/>
         <w:rPr/>
       </w:pPr>
-      <w:bookmarkStart w:id="11" w:name="__RefHeading___Toc904_2869646815"/>
+      <w:bookmarkStart w:id="11" w:name="__RefHeading___Toc935_87357894"/>
       <w:bookmarkStart w:id="12" w:name="защита-от-ошибок"/>
       <w:bookmarkEnd w:id="11"/>
       <w:r>
@@ -1788,7 +1788,7 @@
         <w:pStyle w:val="Heading1"/>
         <w:rPr/>
       </w:pPr>
-      <w:bookmarkStart w:id="15" w:name="__RefHeading___Toc906_2869646815"/>
+      <w:bookmarkStart w:id="15" w:name="__RefHeading___Toc937_87357894"/>
       <w:bookmarkStart w:id="16" w:name="первичная-настройка"/>
       <w:bookmarkEnd w:id="15"/>
       <w:r>
@@ -1808,7 +1808,7 @@
         <w:pStyle w:val="Heading2"/>
         <w:rPr/>
       </w:pPr>
-      <w:bookmarkStart w:id="17" w:name="__RefHeading___Toc908_2869646815"/>
+      <w:bookmarkStart w:id="17" w:name="__RefHeading___Toc939_87357894"/>
       <w:bookmarkStart w:id="18" w:name="после-перехода-с-1.0.1"/>
       <w:bookmarkEnd w:id="17"/>
       <w:r>
@@ -1934,7 +1934,7 @@
         <w:pStyle w:val="Heading2"/>
         <w:rPr/>
       </w:pPr>
-      <w:bookmarkStart w:id="19" w:name="__RefHeading___Toc910_2869646815"/>
+      <w:bookmarkStart w:id="19" w:name="__RefHeading___Toc941_87357894"/>
       <w:bookmarkStart w:id="20" w:name="новая-установка"/>
       <w:bookmarkEnd w:id="19"/>
       <w:r>
@@ -2049,7 +2049,7 @@
         <w:pStyle w:val="Heading1"/>
         <w:rPr/>
       </w:pPr>
-      <w:bookmarkStart w:id="21" w:name="__RefHeading___Toc912_2869646815"/>
+      <w:bookmarkStart w:id="21" w:name="__RefHeading___Toc943_87357894"/>
       <w:bookmarkStart w:id="22" w:name="сотрудники"/>
       <w:bookmarkEnd w:id="21"/>
       <w:r>
@@ -2069,7 +2069,7 @@
         <w:pStyle w:val="Heading2"/>
         <w:rPr/>
       </w:pPr>
-      <w:bookmarkStart w:id="23" w:name="__RefHeading___Toc914_2869646815"/>
+      <w:bookmarkStart w:id="23" w:name="__RefHeading___Toc945_87357894"/>
       <w:bookmarkStart w:id="24" w:name="список"/>
       <w:bookmarkEnd w:id="23"/>
       <w:r>
@@ -2155,21 +2155,31 @@
         <w:pStyle w:val="BodyText"/>
         <w:rPr/>
       </w:pPr>
-      <w:bookmarkStart w:id="25" w:name="список"/>
-      <w:r>
-        <w:rPr/>
-        <w:t>Поиск — по ФИО, логину, должности; фильтр — по роли или «Отключённые»; заголовки столбцов сортируют список. Роль меняется прямо в таблице.</w:t>
-      </w:r>
+      <w:r>
+        <w:rPr/>
+        <w:t xml:space="preserve">Поиск — по ФИО, логину, должности; фильтр — по роли или «Отключённые»; заголовки столбцов сортируют список. Роль меняется прямо в таблице; в уведомлении есть </w:t>
+      </w:r>
+      <w:r>
+        <w:rPr>
+          <w:b/>
+          <w:bCs/>
+        </w:rPr>
+        <w:t>Отменить</w:t>
+      </w:r>
+      <w:r>
+        <w:rPr/>
+        <w:t>. Выдача и снятие роли «Администратор» — с подтверждением.</w:t>
+      </w:r>
+      <w:bookmarkEnd w:id="24"/>
+    </w:p>
+    <w:p>
+      <w:pPr>
+        <w:pStyle w:val="Heading2"/>
+        <w:rPr/>
+      </w:pPr>
+      <w:bookmarkStart w:id="25" w:name="__RefHeading___Toc947_87357894"/>
+      <w:bookmarkStart w:id="26" w:name="добавление-и-изменение"/>
       <w:bookmarkEnd w:id="25"/>
-    </w:p>
-    <w:p>
-      <w:pPr>
-        <w:pStyle w:val="Heading2"/>
-        <w:rPr/>
-      </w:pPr>
-      <w:bookmarkStart w:id="26" w:name="__RefHeading___Toc916_2869646815"/>
-      <w:bookmarkStart w:id="27" w:name="добавление-и-изменение"/>
-      <w:bookmarkEnd w:id="26"/>
       <w:r>
         <w:rPr>
           <w:rStyle w:val="SectionNumber"/>
@@ -2293,16 +2303,16 @@
         <w:rPr/>
         <w:t xml:space="preserve"> Сотрудников, входящих через домен, заводить заранее не обязательно: учётная запись создаётся при первом входе с ролью по умолчанию из настроек домена. Доступы к проектам выдайте после первого входа.</w:t>
       </w:r>
+      <w:bookmarkEnd w:id="26"/>
+    </w:p>
+    <w:p>
+      <w:pPr>
+        <w:pStyle w:val="Heading2"/>
+        <w:rPr/>
+      </w:pPr>
+      <w:bookmarkStart w:id="27" w:name="__RefHeading___Toc949_87357894"/>
+      <w:bookmarkStart w:id="28" w:name="отключение-и-удаление"/>
       <w:bookmarkEnd w:id="27"/>
-    </w:p>
-    <w:p>
-      <w:pPr>
-        <w:pStyle w:val="Heading2"/>
-        <w:rPr/>
-      </w:pPr>
-      <w:bookmarkStart w:id="28" w:name="__RefHeading___Toc918_2869646815"/>
-      <w:bookmarkStart w:id="29" w:name="отключение-и-удаление"/>
-      <w:bookmarkEnd w:id="28"/>
       <w:r>
         <w:rPr>
           <w:rStyle w:val="SectionNumber"/>
@@ -2357,16 +2367,16 @@
         <w:t xml:space="preserve"> (в карточке) — необратимо: пропадают учётная запись и доступы. Комментарии и записи истории остаются с именем сотрудника.</w:t>
       </w:r>
       <w:bookmarkEnd w:id="22"/>
+      <w:bookmarkEnd w:id="28"/>
+    </w:p>
+    <w:p>
+      <w:pPr>
+        <w:pStyle w:val="Heading1"/>
+        <w:rPr/>
+      </w:pPr>
+      <w:bookmarkStart w:id="29" w:name="__RefHeading___Toc951_87357894"/>
+      <w:bookmarkStart w:id="30" w:name="направления"/>
       <w:bookmarkEnd w:id="29"/>
-    </w:p>
-    <w:p>
-      <w:pPr>
-        <w:pStyle w:val="Heading1"/>
-        <w:rPr/>
-      </w:pPr>
-      <w:bookmarkStart w:id="30" w:name="__RefHeading___Toc920_2869646815"/>
-      <w:bookmarkStart w:id="31" w:name="направления"/>
-      <w:bookmarkEnd w:id="30"/>
       <w:r>
         <w:rPr>
           <w:rStyle w:val="SectionNumber"/>
@@ -2475,16 +2485,16 @@
         <w:rPr/>
         <w:t>).</w:t>
       </w:r>
+      <w:bookmarkEnd w:id="30"/>
+    </w:p>
+    <w:p>
+      <w:pPr>
+        <w:pStyle w:val="Heading1"/>
+        <w:rPr/>
+      </w:pPr>
+      <w:bookmarkStart w:id="31" w:name="__RefHeading___Toc953_87357894"/>
+      <w:bookmarkStart w:id="32" w:name="доступы"/>
       <w:bookmarkEnd w:id="31"/>
-    </w:p>
-    <w:p>
-      <w:pPr>
-        <w:pStyle w:val="Heading1"/>
-        <w:rPr/>
-      </w:pPr>
-      <w:bookmarkStart w:id="32" w:name="__RefHeading___Toc922_2869646815"/>
-      <w:bookmarkStart w:id="33" w:name="доступы"/>
-      <w:bookmarkEnd w:id="32"/>
       <w:r>
         <w:rPr>
           <w:rStyle w:val="SectionNumber"/>
@@ -2512,9 +2522,9 @@
         <w:pStyle w:val="Heading2"/>
         <w:rPr/>
       </w:pPr>
-      <w:bookmarkStart w:id="34" w:name="__RefHeading___Toc924_2869646815"/>
-      <w:bookmarkStart w:id="35" w:name="выдать-доступ"/>
-      <w:bookmarkEnd w:id="34"/>
+      <w:bookmarkStart w:id="33" w:name="__RefHeading___Toc955_87357894"/>
+      <w:bookmarkStart w:id="34" w:name="выдать-доступ"/>
+      <w:bookmarkEnd w:id="33"/>
       <w:r>
         <w:rPr>
           <w:rStyle w:val="SectionNumber"/>
@@ -2673,21 +2683,21 @@
         <w:pStyle w:val="ImageCaption"/>
         <w:rPr/>
       </w:pPr>
-      <w:bookmarkStart w:id="36" w:name="выдать-доступ"/>
+      <w:bookmarkStart w:id="35" w:name="выдать-доступ"/>
       <w:r>
         <w:rPr/>
         <w:t>Выдача доступа</w:t>
       </w:r>
+      <w:bookmarkEnd w:id="35"/>
+    </w:p>
+    <w:p>
+      <w:pPr>
+        <w:pStyle w:val="Heading2"/>
+        <w:rPr/>
+      </w:pPr>
+      <w:bookmarkStart w:id="36" w:name="__RefHeading___Toc957_87357894"/>
+      <w:bookmarkStart w:id="37" w:name="правила"/>
       <w:bookmarkEnd w:id="36"/>
-    </w:p>
-    <w:p>
-      <w:pPr>
-        <w:pStyle w:val="Heading2"/>
-        <w:rPr/>
-      </w:pPr>
-      <w:bookmarkStart w:id="37" w:name="__RefHeading___Toc926_2869646815"/>
-      <w:bookmarkStart w:id="38" w:name="правила"/>
-      <w:bookmarkEnd w:id="37"/>
       <w:r>
         <w:rPr>
           <w:rStyle w:val="SectionNumber"/>
@@ -2742,16 +2752,16 @@
         <w:rPr/>
         <w:t xml:space="preserve"> — несколько сразу.</w:t>
       </w:r>
+      <w:bookmarkEnd w:id="37"/>
+    </w:p>
+    <w:p>
+      <w:pPr>
+        <w:pStyle w:val="Heading2"/>
+        <w:rPr/>
+      </w:pPr>
+      <w:bookmarkStart w:id="38" w:name="__RefHeading___Toc959_87357894"/>
+      <w:bookmarkStart w:id="39" w:name="кто-что-видит"/>
       <w:bookmarkEnd w:id="38"/>
-    </w:p>
-    <w:p>
-      <w:pPr>
-        <w:pStyle w:val="Heading2"/>
-        <w:rPr/>
-      </w:pPr>
-      <w:bookmarkStart w:id="39" w:name="__RefHeading___Toc928_2869646815"/>
-      <w:bookmarkStart w:id="40" w:name="кто-что-видит"/>
-      <w:bookmarkEnd w:id="39"/>
       <w:r>
         <w:rPr>
           <w:rStyle w:val="SectionNumber"/>
@@ -2825,23 +2835,23 @@
         <w:pStyle w:val="ImageCaption"/>
         <w:rPr/>
       </w:pPr>
-      <w:bookmarkStart w:id="41" w:name="доступы"/>
-      <w:bookmarkStart w:id="42" w:name="кто-что-видит"/>
+      <w:bookmarkStart w:id="40" w:name="доступы"/>
+      <w:bookmarkStart w:id="41" w:name="кто-что-видит"/>
       <w:r>
         <w:rPr/>
         <w:t>Кто что видит</w:t>
       </w:r>
+      <w:bookmarkEnd w:id="40"/>
       <w:bookmarkEnd w:id="41"/>
+    </w:p>
+    <w:p>
+      <w:pPr>
+        <w:pStyle w:val="Heading1"/>
+        <w:rPr/>
+      </w:pPr>
+      <w:bookmarkStart w:id="42" w:name="__RefHeading___Toc961_87357894"/>
+      <w:bookmarkStart w:id="43" w:name="реестр-изменений"/>
       <w:bookmarkEnd w:id="42"/>
-    </w:p>
-    <w:p>
-      <w:pPr>
-        <w:pStyle w:val="Heading1"/>
-        <w:rPr/>
-      </w:pPr>
-      <w:bookmarkStart w:id="43" w:name="__RefHeading___Toc930_2869646815"/>
-      <w:bookmarkStart w:id="44" w:name="реестр-изменений"/>
-      <w:bookmarkEnd w:id="43"/>
       <w:r>
         <w:rPr>
           <w:rStyle w:val="SectionNumber"/>
@@ -2927,6 +2937,16 @@
       </w:pPr>
       <w:r>
         <w:rPr/>
+        <w:t>Автор показан по ФИО (логин — во всплывающей подсказке), объекты — названиями («Проект «…»», «Сотрудник …»), поля и значения — по-русски; записи, перенесённые из прежней версии, показываются так же (сами записи не меняются). Длинные значения переносятся; щелчок по строке показывает запись целиком.</w:t>
+      </w:r>
+    </w:p>
+    <w:p>
+      <w:pPr>
+        <w:pStyle w:val="BodyText"/>
+        <w:rPr/>
+      </w:pPr>
+      <w:r>
+        <w:rPr/>
         <w:t xml:space="preserve">Фильтры: раздел, действие, автор, проект, период; поиск по тексту. </w:t>
       </w:r>
       <w:r>
@@ -2940,16 +2960,16 @@
         <w:rPr/>
         <w:t xml:space="preserve"> — записи с текущими фильтрами для Excel. Подробная история правок конкретного плана — в «Истории плана» на экране проекта.</w:t>
       </w:r>
+      <w:bookmarkEnd w:id="43"/>
+    </w:p>
+    <w:p>
+      <w:pPr>
+        <w:pStyle w:val="Heading1"/>
+        <w:rPr/>
+      </w:pPr>
+      <w:bookmarkStart w:id="44" w:name="__RefHeading___Toc963_87357894"/>
+      <w:bookmarkStart w:id="45" w:name="корзина"/>
       <w:bookmarkEnd w:id="44"/>
-    </w:p>
-    <w:p>
-      <w:pPr>
-        <w:pStyle w:val="Heading1"/>
-        <w:rPr/>
-      </w:pPr>
-      <w:bookmarkStart w:id="45" w:name="__RefHeading___Toc932_2869646815"/>
-      <w:bookmarkStart w:id="46" w:name="корзина"/>
-      <w:bookmarkEnd w:id="45"/>
       <w:r>
         <w:rPr>
           <w:rStyle w:val="SectionNumber"/>
@@ -2980,7 +3000,7 @@
       </w:r>
       <w:r>
         <w:rPr/>
-        <w:t xml:space="preserve"> возвращает объект на место (проект — в своё направление, план — в архив проекта). </w:t>
+        <w:t xml:space="preserve"> возвращает объект на место (проект — в своё направление, план — во вкладки или в архив проекта, откуда его удалили). </w:t>
       </w:r>
       <w:r>
         <w:rPr>
@@ -2991,7 +3011,39 @@
       </w:r>
       <w:r>
         <w:rPr/>
-        <w:t xml:space="preserve"> — необратимо.</w:t>
+        <w:t xml:space="preserve"> — необратимо и доступно только администратору.</w:t>
+      </w:r>
+    </w:p>
+    <w:p>
+      <w:pPr>
+        <w:pStyle w:val="BodyText"/>
+        <w:rPr/>
+      </w:pPr>
+      <w:r>
+        <w:rPr/>
+        <w:t xml:space="preserve">Менеджер видит в боковом меню свою </w:t>
+      </w:r>
+      <w:r>
+        <w:rPr>
+          <w:b/>
+          <w:bCs/>
+        </w:rPr>
+        <w:t>Корзину</w:t>
+      </w:r>
+      <w:r>
+        <w:rPr/>
+        <w:t xml:space="preserve"> — удалённые планы проектов, которыми он полностью управляет, — и может вернуть их. Сразу после удаления проект или план можно вернуть и кнопкой </w:t>
+      </w:r>
+      <w:r>
+        <w:rPr>
+          <w:b/>
+          <w:bCs/>
+        </w:rPr>
+        <w:t>Отменить</w:t>
+      </w:r>
+      <w:r>
+        <w:rPr/>
+        <w:t xml:space="preserve"> в уведомлении.</w:t>
       </w:r>
     </w:p>
     <w:p>
@@ -3045,21 +3097,21 @@
         <w:pStyle w:val="ImageCaption"/>
         <w:rPr/>
       </w:pPr>
-      <w:bookmarkStart w:id="47" w:name="корзина"/>
+      <w:bookmarkStart w:id="46" w:name="корзина"/>
       <w:r>
         <w:rPr/>
         <w:t>Корзина</w:t>
       </w:r>
+      <w:bookmarkEnd w:id="46"/>
+    </w:p>
+    <w:p>
+      <w:pPr>
+        <w:pStyle w:val="Heading1"/>
+        <w:rPr/>
+      </w:pPr>
+      <w:bookmarkStart w:id="47" w:name="__RefHeading___Toc965_87357894"/>
+      <w:bookmarkStart w:id="48" w:name="вход-через-домен"/>
       <w:bookmarkEnd w:id="47"/>
-    </w:p>
-    <w:p>
-      <w:pPr>
-        <w:pStyle w:val="Heading1"/>
-        <w:rPr/>
-      </w:pPr>
-      <w:bookmarkStart w:id="48" w:name="__RefHeading___Toc934_2869646815"/>
-      <w:bookmarkStart w:id="49" w:name="вход-через-домен"/>
-      <w:bookmarkEnd w:id="48"/>
       <w:r>
         <w:rPr>
           <w:rStyle w:val="SectionNumber"/>
@@ -3154,8 +3206,8 @@
         <w:tblLook w:val="0020" w:noHBand="0" w:noVBand="0" w:firstColumn="0" w:lastRow="0" w:lastColumn="0" w:firstRow="1"/>
       </w:tblPr>
       <w:tblGrid>
-        <w:gridCol w:w="1666"/>
-        <w:gridCol w:w="7693"/>
+        <w:gridCol w:w="1644"/>
+        <w:gridCol w:w="7715"/>
       </w:tblGrid>
       <w:tr>
         <w:trPr>
@@ -3163,7 +3215,7 @@
         </w:trPr>
         <w:tc>
           <w:tcPr>
-            <w:tcW w:w="1666" w:type="dxa"/>
+            <w:tcW w:w="1644" w:type="dxa"/>
             <w:tcBorders>
               <w:top w:val="single" w:sz="4" w:space="0" w:color="D6DCEA"/>
               <w:left w:val="single" w:sz="4" w:space="0" w:color="D6DCEA"/>
@@ -3199,7 +3251,7 @@
         </w:tc>
         <w:tc>
           <w:tcPr>
-            <w:tcW w:w="7693" w:type="dxa"/>
+            <w:tcW w:w="7715" w:type="dxa"/>
             <w:tcBorders>
               <w:top w:val="single" w:sz="4" w:space="0" w:color="D6DCEA"/>
               <w:left w:val="single" w:sz="4" w:space="0" w:color="D6DCEA"/>
@@ -3238,7 +3290,7 @@
         <w:trPr/>
         <w:tc>
           <w:tcPr>
-            <w:tcW w:w="1666" w:type="dxa"/>
+            <w:tcW w:w="1644" w:type="dxa"/>
             <w:tcBorders>
               <w:top w:val="single" w:sz="4" w:space="0" w:color="D6DCEA"/>
               <w:left w:val="single" w:sz="4" w:space="0" w:color="D6DCEA"/>
@@ -3271,7 +3323,7 @@
         </w:tc>
         <w:tc>
           <w:tcPr>
-            <w:tcW w:w="7693" w:type="dxa"/>
+            <w:tcW w:w="7715" w:type="dxa"/>
             <w:tcBorders>
               <w:top w:val="single" w:sz="4" w:space="0" w:color="D6DCEA"/>
               <w:left w:val="single" w:sz="4" w:space="0" w:color="D6DCEA"/>
@@ -3342,6 +3394,15 @@
               </w:rPr>
               <w:t>Сначала домен, затем пароль системы</w:t>
             </w:r>
+            <w:r>
+              <w:rPr>
+                <w:kern w:val="0"/>
+                <w:sz w:val="18"/>
+                <w:szCs w:val="24"/>
+                <w:lang w:val="ru-RU" w:eastAsia="en-US" w:bidi="ar-SA"/>
+              </w:rPr>
+              <w:t xml:space="preserve"> (выбирается сам при включении входа через домен)</w:t>
+            </w:r>
           </w:p>
         </w:tc>
       </w:tr>
@@ -3349,7 +3410,7 @@
         <w:trPr/>
         <w:tc>
           <w:tcPr>
-            <w:tcW w:w="1666" w:type="dxa"/>
+            <w:tcW w:w="1644" w:type="dxa"/>
             <w:tcBorders>
               <w:top w:val="single" w:sz="4" w:space="0" w:color="D6DCEA"/>
               <w:left w:val="single" w:sz="4" w:space="0" w:color="D6DCEA"/>
@@ -3382,7 +3443,7 @@
         </w:tc>
         <w:tc>
           <w:tcPr>
-            <w:tcW w:w="7693" w:type="dxa"/>
+            <w:tcW w:w="7715" w:type="dxa"/>
             <w:tcBorders>
               <w:top w:val="single" w:sz="4" w:space="0" w:color="D6DCEA"/>
               <w:left w:val="single" w:sz="4" w:space="0" w:color="D6DCEA"/>
@@ -3438,7 +3499,7 @@
         <w:trPr/>
         <w:tc>
           <w:tcPr>
-            <w:tcW w:w="1666" w:type="dxa"/>
+            <w:tcW w:w="1644" w:type="dxa"/>
             <w:tcBorders>
               <w:top w:val="single" w:sz="4" w:space="0" w:color="D6DCEA"/>
               <w:left w:val="single" w:sz="4" w:space="0" w:color="D6DCEA"/>
@@ -3471,7 +3532,7 @@
         </w:tc>
         <w:tc>
           <w:tcPr>
-            <w:tcW w:w="7693" w:type="dxa"/>
+            <w:tcW w:w="7715" w:type="dxa"/>
             <w:tcBorders>
               <w:top w:val="single" w:sz="4" w:space="0" w:color="D6DCEA"/>
               <w:left w:val="single" w:sz="4" w:space="0" w:color="D6DCEA"/>
@@ -3517,7 +3578,7 @@
         <w:trPr/>
         <w:tc>
           <w:tcPr>
-            <w:tcW w:w="1666" w:type="dxa"/>
+            <w:tcW w:w="1644" w:type="dxa"/>
             <w:tcBorders>
               <w:top w:val="single" w:sz="4" w:space="0" w:color="D6DCEA"/>
               <w:left w:val="single" w:sz="4" w:space="0" w:color="D6DCEA"/>
@@ -3550,7 +3611,7 @@
         </w:tc>
         <w:tc>
           <w:tcPr>
-            <w:tcW w:w="7693" w:type="dxa"/>
+            <w:tcW w:w="7715" w:type="dxa"/>
             <w:tcBorders>
               <w:top w:val="single" w:sz="4" w:space="0" w:color="D6DCEA"/>
               <w:left w:val="single" w:sz="4" w:space="0" w:color="D6DCEA"/>
@@ -3586,7 +3647,7 @@
         <w:trPr/>
         <w:tc>
           <w:tcPr>
-            <w:tcW w:w="1666" w:type="dxa"/>
+            <w:tcW w:w="1644" w:type="dxa"/>
             <w:tcBorders>
               <w:top w:val="single" w:sz="4" w:space="0" w:color="D6DCEA"/>
               <w:left w:val="single" w:sz="4" w:space="0" w:color="D6DCEA"/>
@@ -3619,7 +3680,7 @@
         </w:tc>
         <w:tc>
           <w:tcPr>
-            <w:tcW w:w="7693" w:type="dxa"/>
+            <w:tcW w:w="7715" w:type="dxa"/>
             <w:tcBorders>
               <w:top w:val="single" w:sz="4" w:space="0" w:color="D6DCEA"/>
               <w:left w:val="single" w:sz="4" w:space="0" w:color="D6DCEA"/>
@@ -3665,7 +3726,7 @@
         <w:trPr/>
         <w:tc>
           <w:tcPr>
-            <w:tcW w:w="1666" w:type="dxa"/>
+            <w:tcW w:w="1644" w:type="dxa"/>
             <w:tcBorders>
               <w:top w:val="single" w:sz="4" w:space="0" w:color="D6DCEA"/>
               <w:left w:val="single" w:sz="4" w:space="0" w:color="D6DCEA"/>
@@ -3698,7 +3759,7 @@
         </w:tc>
         <w:tc>
           <w:tcPr>
-            <w:tcW w:w="7693" w:type="dxa"/>
+            <w:tcW w:w="7715" w:type="dxa"/>
             <w:tcBorders>
               <w:top w:val="single" w:sz="4" w:space="0" w:color="D6DCEA"/>
               <w:left w:val="single" w:sz="4" w:space="0" w:color="D6DCEA"/>
@@ -3773,7 +3834,7 @@
         <w:trPr/>
         <w:tc>
           <w:tcPr>
-            <w:tcW w:w="1666" w:type="dxa"/>
+            <w:tcW w:w="1644" w:type="dxa"/>
             <w:tcBorders>
               <w:top w:val="single" w:sz="4" w:space="0" w:color="D6DCEA"/>
               <w:left w:val="single" w:sz="4" w:space="0" w:color="D6DCEA"/>
@@ -3806,7 +3867,7 @@
         </w:tc>
         <w:tc>
           <w:tcPr>
-            <w:tcW w:w="7693" w:type="dxa"/>
+            <w:tcW w:w="7715" w:type="dxa"/>
             <w:tcBorders>
               <w:top w:val="single" w:sz="4" w:space="0" w:color="D6DCEA"/>
               <w:left w:val="single" w:sz="4" w:space="0" w:color="D6DCEA"/>
@@ -3947,7 +4008,7 @@
         <w:trPr/>
         <w:tc>
           <w:tcPr>
-            <w:tcW w:w="1666" w:type="dxa"/>
+            <w:tcW w:w="1644" w:type="dxa"/>
             <w:tcBorders>
               <w:top w:val="single" w:sz="4" w:space="0" w:color="D6DCEA"/>
               <w:left w:val="single" w:sz="4" w:space="0" w:color="D6DCEA"/>
@@ -3980,7 +4041,7 @@
         </w:tc>
         <w:tc>
           <w:tcPr>
-            <w:tcW w:w="7693" w:type="dxa"/>
+            <w:tcW w:w="7715" w:type="dxa"/>
             <w:tcBorders>
               <w:top w:val="single" w:sz="4" w:space="0" w:color="D6DCEA"/>
               <w:left w:val="single" w:sz="4" w:space="0" w:color="D6DCEA"/>
@@ -4016,7 +4077,7 @@
         <w:trPr/>
         <w:tc>
           <w:tcPr>
-            <w:tcW w:w="1666" w:type="dxa"/>
+            <w:tcW w:w="1644" w:type="dxa"/>
             <w:tcBorders>
               <w:top w:val="single" w:sz="4" w:space="0" w:color="D6DCEA"/>
               <w:left w:val="single" w:sz="4" w:space="0" w:color="D6DCEA"/>
@@ -4049,7 +4110,7 @@
         </w:tc>
         <w:tc>
           <w:tcPr>
-            <w:tcW w:w="7693" w:type="dxa"/>
+            <w:tcW w:w="7715" w:type="dxa"/>
             <w:tcBorders>
               <w:top w:val="single" w:sz="4" w:space="0" w:color="D6DCEA"/>
               <w:left w:val="single" w:sz="4" w:space="0" w:color="D6DCEA"/>
@@ -4088,21 +4149,42 @@
         <w:rPr/>
       </w:pPr>
       <w:r>
+        <w:rPr/>
+        <w:t xml:space="preserve">Изменения применяются кнопкой </w:t>
+      </w:r>
+      <w:r>
         <w:rPr>
           <w:b/>
           <w:bCs/>
         </w:rPr>
-        <w:t>Проверить подключение</w:t>
-      </w:r>
-      <w:r>
-        <w:rPr/>
-        <w:t xml:space="preserve"> — подключение сервисной учётной записью без сохранения. </w:t>
-      </w:r>
+        <w:t>Сохранить</w:t>
+      </w:r>
+      <w:r>
+        <w:rPr/>
+        <w:t>; если уйти со страницы с несохранёнными изменениями, система спросит, сохранить ли их.</w:t>
+      </w:r>
+    </w:p>
+    <w:p>
+      <w:pPr>
+        <w:pStyle w:val="BodyText"/>
+        <w:rPr/>
+      </w:pPr>
       <w:r>
         <w:rPr>
           <w:b/>
           <w:bCs/>
         </w:rPr>
+        <w:t>Проверить подключение</w:t>
+      </w:r>
+      <w:r>
+        <w:rPr/>
+        <w:t xml:space="preserve"> — подключение сервисной учётной записью без сохранения. </w:t>
+      </w:r>
+      <w:r>
+        <w:rPr>
+          <w:b/>
+          <w:bCs/>
+        </w:rPr>
         <w:t>Сохранить</w:t>
       </w:r>
       <w:r>
@@ -4115,21 +4197,21 @@
         <w:pStyle w:val="BodyText"/>
         <w:rPr/>
       </w:pPr>
-      <w:bookmarkStart w:id="50" w:name="вход-через-домен"/>
+      <w:bookmarkStart w:id="49" w:name="вход-через-домен"/>
       <w:r>
         <w:rPr/>
         <w:t>При входе через домен ФИО и email сотрудника обновляются из каталога. Если сотрудник раньше входил по паролю системы, его учётная запись переводится на вход через домен (пароль системы удаляется). Исключение — локальные администраторы: они никогда не связываются с каталогом и всегда входят паролем системы (иначе учётная запись каталога с тем же логином получила бы права администратора).</w:t>
       </w:r>
+      <w:bookmarkEnd w:id="49"/>
+    </w:p>
+    <w:p>
+      <w:pPr>
+        <w:pStyle w:val="Heading1"/>
+        <w:rPr/>
+      </w:pPr>
+      <w:bookmarkStart w:id="50" w:name="__RefHeading___Toc967_87357894"/>
+      <w:bookmarkStart w:id="51" w:name="производственный-календарь"/>
       <w:bookmarkEnd w:id="50"/>
-    </w:p>
-    <w:p>
-      <w:pPr>
-        <w:pStyle w:val="Heading1"/>
-        <w:rPr/>
-      </w:pPr>
-      <w:bookmarkStart w:id="51" w:name="__RefHeading___Toc936_2869646815"/>
-      <w:bookmarkStart w:id="52" w:name="производственный-календарь"/>
-      <w:bookmarkEnd w:id="51"/>
       <w:r>
         <w:rPr>
           <w:rStyle w:val="SectionNumber"/>
@@ -4285,16 +4367,16 @@
         <w:rPr/>
         <w:t xml:space="preserve"> Постановление о переносе выходных на следующий год обычно выходит осенью — добавьте дни, как только оно опубликовано.</w:t>
       </w:r>
+      <w:bookmarkEnd w:id="51"/>
+    </w:p>
+    <w:p>
+      <w:pPr>
+        <w:pStyle w:val="Heading1"/>
+        <w:rPr/>
+      </w:pPr>
+      <w:bookmarkStart w:id="52" w:name="__RefHeading___Toc969_87357894"/>
+      <w:bookmarkStart w:id="53" w:name="работа-сервиса"/>
       <w:bookmarkEnd w:id="52"/>
-    </w:p>
-    <w:p>
-      <w:pPr>
-        <w:pStyle w:val="Heading1"/>
-        <w:rPr/>
-      </w:pPr>
-      <w:bookmarkStart w:id="53" w:name="__RefHeading___Toc938_2869646815"/>
-      <w:bookmarkStart w:id="54" w:name="работа-сервиса"/>
-      <w:bookmarkEnd w:id="53"/>
       <w:r>
         <w:rPr>
           <w:rStyle w:val="SectionNumber"/>
@@ -4410,16 +4492,16 @@
         <w:rPr/>
         <w:t>.</w:t>
       </w:r>
+      <w:bookmarkEnd w:id="53"/>
+    </w:p>
+    <w:p>
+      <w:pPr>
+        <w:pStyle w:val="Heading1"/>
+        <w:rPr/>
+      </w:pPr>
+      <w:bookmarkStart w:id="54" w:name="__RefHeading___Toc971_87357894"/>
+      <w:bookmarkStart w:id="55" w:name="сценарии-администратора"/>
       <w:bookmarkEnd w:id="54"/>
-    </w:p>
-    <w:p>
-      <w:pPr>
-        <w:pStyle w:val="Heading1"/>
-        <w:rPr/>
-      </w:pPr>
-      <w:bookmarkStart w:id="55" w:name="__RefHeading___Toc940_2869646815"/>
-      <w:bookmarkStart w:id="56" w:name="сценарии-администратора"/>
-      <w:bookmarkEnd w:id="55"/>
       <w:r>
         <w:rPr>
           <w:rStyle w:val="SectionNumber"/>
@@ -4437,9 +4519,9 @@
         <w:pStyle w:val="Heading2"/>
         <w:rPr/>
       </w:pPr>
-      <w:bookmarkStart w:id="57" w:name="__RefHeading___Toc942_2869646815"/>
-      <w:bookmarkStart w:id="58" w:name="X525cf896d0e0da260fae1e7259530962a7d5ac1"/>
-      <w:bookmarkEnd w:id="57"/>
+      <w:bookmarkStart w:id="56" w:name="__RefHeading___Toc973_87357894"/>
+      <w:bookmarkStart w:id="57" w:name="X525cf896d0e0da260fae1e7259530962a7d5ac1"/>
+      <w:bookmarkEnd w:id="56"/>
       <w:r>
         <w:rPr>
           <w:rStyle w:val="SectionNumber"/>
@@ -4503,21 +4585,21 @@
         </w:numPr>
         <w:rPr/>
       </w:pPr>
-      <w:bookmarkStart w:id="59" w:name="X525cf896d0e0da260fae1e7259530962a7d5ac1"/>
+      <w:bookmarkStart w:id="58" w:name="X525cf896d0e0da260fae1e7259530962a7d5ac1"/>
       <w:r>
         <w:rPr/>
         <w:t>Сотрудник входит и видит все проекты направления, включая будущие.</w:t>
       </w:r>
+      <w:bookmarkEnd w:id="58"/>
+    </w:p>
+    <w:p>
+      <w:pPr>
+        <w:pStyle w:val="Heading2"/>
+        <w:rPr/>
+      </w:pPr>
+      <w:bookmarkStart w:id="59" w:name="__RefHeading___Toc975_87357894"/>
+      <w:bookmarkStart w:id="60" w:name="сценарий-а2.-увольнение"/>
       <w:bookmarkEnd w:id="59"/>
-    </w:p>
-    <w:p>
-      <w:pPr>
-        <w:pStyle w:val="Heading2"/>
-        <w:rPr/>
-      </w:pPr>
-      <w:bookmarkStart w:id="60" w:name="__RefHeading___Toc944_2869646815"/>
-      <w:bookmarkStart w:id="61" w:name="сценарий-а2.-увольнение"/>
-      <w:bookmarkEnd w:id="60"/>
       <w:r>
         <w:rPr>
           <w:rStyle w:val="SectionNumber"/>
@@ -4573,7 +4655,7 @@
       </w:pPr>
       <w:r>
         <w:rPr/>
-        <w:t>В планах, где он ответственный, назначьте нового исполнителя (карточка задачи или «Исполнители плана»).</w:t>
+        <w:t>В планах, где он исполнитель, назначьте другого исполнителя (карточка задачи или «Исполнители плана»).</w:t>
       </w:r>
     </w:p>
     <w:p>
@@ -4585,21 +4667,21 @@
         </w:numPr>
         <w:rPr/>
       </w:pPr>
-      <w:bookmarkStart w:id="62" w:name="сценарий-а2.-увольнение"/>
+      <w:bookmarkStart w:id="61" w:name="сценарий-а2.-увольнение"/>
       <w:r>
         <w:rPr/>
         <w:t>Учётную запись не удаляйте — его комментарии и история останутся понятными.</w:t>
       </w:r>
+      <w:bookmarkEnd w:id="61"/>
+    </w:p>
+    <w:p>
+      <w:pPr>
+        <w:pStyle w:val="Heading2"/>
+        <w:rPr/>
+      </w:pPr>
+      <w:bookmarkStart w:id="62" w:name="__RefHeading___Toc977_87357894"/>
+      <w:bookmarkStart w:id="63" w:name="X40b3630711ad101350b0dd1e981711065e8bd89"/>
       <w:bookmarkEnd w:id="62"/>
-    </w:p>
-    <w:p>
-      <w:pPr>
-        <w:pStyle w:val="Heading2"/>
-        <w:rPr/>
-      </w:pPr>
-      <w:bookmarkStart w:id="63" w:name="__RefHeading___Toc946_2869646815"/>
-      <w:bookmarkStart w:id="64" w:name="X40b3630711ad101350b0dd1e981711065e8bd89"/>
-      <w:bookmarkEnd w:id="63"/>
       <w:r>
         <w:rPr>
           <w:rStyle w:val="SectionNumber"/>
@@ -4617,21 +4699,21 @@
         <w:pStyle w:val="FirstParagraph"/>
         <w:rPr/>
       </w:pPr>
-      <w:bookmarkStart w:id="65" w:name="X40b3630711ad101350b0dd1e981711065e8bd89"/>
+      <w:bookmarkStart w:id="64" w:name="X40b3630711ad101350b0dd1e981711065e8bd89"/>
       <w:r>
         <w:rPr/>
         <w:t>Роль «Наблюдатель» ограничивает любой доступ просмотром. Смените роль на «Редактор» (в таблице сотрудников) и проверьте уровень доступа к проекту — «Редактирование».</w:t>
       </w:r>
+      <w:bookmarkEnd w:id="64"/>
+    </w:p>
+    <w:p>
+      <w:pPr>
+        <w:pStyle w:val="Heading2"/>
+        <w:rPr/>
+      </w:pPr>
+      <w:bookmarkStart w:id="65" w:name="__RefHeading___Toc979_87357894"/>
+      <w:bookmarkStart w:id="66" w:name="X47b085d6f5d4ae9e2a209044082e45befec994f"/>
       <w:bookmarkEnd w:id="65"/>
-    </w:p>
-    <w:p>
-      <w:pPr>
-        <w:pStyle w:val="Heading2"/>
-        <w:rPr/>
-      </w:pPr>
-      <w:bookmarkStart w:id="66" w:name="__RefHeading___Toc948_2869646815"/>
-      <w:bookmarkStart w:id="67" w:name="X47b085d6f5d4ae9e2a209044082e45befec994f"/>
-      <w:bookmarkEnd w:id="66"/>
       <w:r>
         <w:rPr>
           <w:rStyle w:val="SectionNumber"/>
@@ -4660,16 +4742,16 @@
         <w:rPr/>
         <w:t>: руководитель → направление целиком → «Просмотр» (или «Редактирование»). Роль «Менеджер» даст ему право создавать проекты.</w:t>
       </w:r>
+      <w:bookmarkEnd w:id="66"/>
+    </w:p>
+    <w:p>
+      <w:pPr>
+        <w:pStyle w:val="Heading2"/>
+        <w:rPr/>
+      </w:pPr>
+      <w:bookmarkStart w:id="67" w:name="__RefHeading___Toc981_87357894"/>
+      <w:bookmarkStart w:id="68" w:name="Xe1ad479a47bf9d896db09fa985b7ceb589233e6"/>
       <w:bookmarkEnd w:id="67"/>
-    </w:p>
-    <w:p>
-      <w:pPr>
-        <w:pStyle w:val="Heading2"/>
-        <w:rPr/>
-      </w:pPr>
-      <w:bookmarkStart w:id="68" w:name="__RefHeading___Toc950_2869646815"/>
-      <w:bookmarkStart w:id="69" w:name="Xe1ad479a47bf9d896db09fa985b7ceb589233e6"/>
-      <w:bookmarkEnd w:id="68"/>
       <w:r>
         <w:rPr>
           <w:rStyle w:val="SectionNumber"/>
@@ -4707,7 +4789,7 @@
       </w:r>
       <w:r>
         <w:rPr/>
-        <w:t xml:space="preserve">: план возвращается в архив проекта; откройте проект → </w:t>
+        <w:t xml:space="preserve">: план возвращается туда, откуда его удалили, — во вкладки или в архив проекта (тогда откройте проект → </w:t>
       </w:r>
       <w:r>
         <w:rPr>
@@ -4729,18 +4811,18 @@
       </w:r>
       <w:r>
         <w:rPr/>
-        <w:t>.</w:t>
-      </w:r>
+        <w:t>).</w:t>
+      </w:r>
+      <w:bookmarkEnd w:id="68"/>
+    </w:p>
+    <w:p>
+      <w:pPr>
+        <w:pStyle w:val="Heading2"/>
+        <w:rPr/>
+      </w:pPr>
+      <w:bookmarkStart w:id="69" w:name="__RefHeading___Toc983_87357894"/>
+      <w:bookmarkStart w:id="70" w:name="сценарий-а6.-сотрудник-забыл-пароль"/>
       <w:bookmarkEnd w:id="69"/>
-    </w:p>
-    <w:p>
-      <w:pPr>
-        <w:pStyle w:val="Heading2"/>
-        <w:rPr/>
-      </w:pPr>
-      <w:bookmarkStart w:id="70" w:name="__RefHeading___Toc952_2869646815"/>
-      <w:bookmarkStart w:id="71" w:name="сценарий-а6.-сотрудник-забыл-пароль"/>
-      <w:bookmarkEnd w:id="70"/>
       <w:r>
         <w:rPr>
           <w:rStyle w:val="SectionNumber"/>
@@ -4784,16 +4866,16 @@
         <w:rPr/>
         <w:t xml:space="preserve"> → сообщите временный пароль, сотрудник сменит его в профиле. Для входа через домен пароль меняется средствами домена.</w:t>
       </w:r>
+      <w:bookmarkEnd w:id="70"/>
+    </w:p>
+    <w:p>
+      <w:pPr>
+        <w:pStyle w:val="Heading2"/>
+        <w:rPr/>
+      </w:pPr>
+      <w:bookmarkStart w:id="71" w:name="__RefHeading___Toc985_87357894"/>
+      <w:bookmarkStart w:id="72" w:name="сценарий-а7.-переход-на-вход-через-домен"/>
       <w:bookmarkEnd w:id="71"/>
-    </w:p>
-    <w:p>
-      <w:pPr>
-        <w:pStyle w:val="Heading2"/>
-        <w:rPr/>
-      </w:pPr>
-      <w:bookmarkStart w:id="72" w:name="__RefHeading___Toc954_2869646815"/>
-      <w:bookmarkStart w:id="73" w:name="сценарий-а7.-переход-на-вход-через-домен"/>
-      <w:bookmarkEnd w:id="72"/>
       <w:r>
         <w:rPr>
           <w:rStyle w:val="SectionNumber"/>
@@ -4897,16 +4979,16 @@
         <w:rPr/>
         <w:t xml:space="preserve"> — локальные администраторы сохранят вход по паролю.</w:t>
       </w:r>
+      <w:bookmarkEnd w:id="72"/>
+    </w:p>
+    <w:p>
+      <w:pPr>
+        <w:pStyle w:val="Heading2"/>
+        <w:rPr/>
+      </w:pPr>
+      <w:bookmarkStart w:id="73" w:name="__RefHeading___Toc987_87357894"/>
+      <w:bookmarkStart w:id="74" w:name="сценарий-а8.-кто-удалил-строку-в-плане"/>
       <w:bookmarkEnd w:id="73"/>
-    </w:p>
-    <w:p>
-      <w:pPr>
-        <w:pStyle w:val="Heading2"/>
-        <w:rPr/>
-      </w:pPr>
-      <w:bookmarkStart w:id="74" w:name="__RefHeading___Toc956_2869646815"/>
-      <w:bookmarkStart w:id="75" w:name="сценарий-а8.-кто-удалил-строку-в-плане"/>
-      <w:bookmarkEnd w:id="74"/>
       <w:r>
         <w:rPr>
           <w:rStyle w:val="SectionNumber"/>
@@ -4950,17 +5032,17 @@
         <w:rPr/>
         <w:t xml:space="preserve"> с фильтром по проекту.</w:t>
       </w:r>
-      <w:bookmarkEnd w:id="56"/>
+      <w:bookmarkEnd w:id="55"/>
+      <w:bookmarkEnd w:id="74"/>
+    </w:p>
+    <w:p>
+      <w:pPr>
+        <w:pStyle w:val="Heading1"/>
+        <w:rPr/>
+      </w:pPr>
+      <w:bookmarkStart w:id="75" w:name="__RefHeading___Toc989_87357894"/>
+      <w:bookmarkStart w:id="76" w:name="рекомендации-по-безопасности"/>
       <w:bookmarkEnd w:id="75"/>
-    </w:p>
-    <w:p>
-      <w:pPr>
-        <w:pStyle w:val="Heading1"/>
-        <w:rPr/>
-      </w:pPr>
-      <w:bookmarkStart w:id="76" w:name="__RefHeading___Toc958_2869646815"/>
-      <w:bookmarkStart w:id="77" w:name="рекомендации-по-безопасности"/>
-      <w:bookmarkEnd w:id="76"/>
       <w:r>
         <w:rPr>
           <w:rStyle w:val="SectionNumber"/>
@@ -5064,16 +5146,16 @@
         <w:rPr/>
         <w:t>.</w:t>
       </w:r>
+      <w:bookmarkEnd w:id="76"/>
+    </w:p>
+    <w:p>
+      <w:pPr>
+        <w:pStyle w:val="Heading1"/>
+        <w:rPr/>
+      </w:pPr>
+      <w:bookmarkStart w:id="77" w:name="__RefHeading___Toc991_87357894"/>
+      <w:bookmarkStart w:id="78" w:name="частые-вопросы"/>
       <w:bookmarkEnd w:id="77"/>
-    </w:p>
-    <w:p>
-      <w:pPr>
-        <w:pStyle w:val="Heading1"/>
-        <w:rPr/>
-      </w:pPr>
-      <w:bookmarkStart w:id="78" w:name="__RefHeading___Toc960_2869646815"/>
-      <w:bookmarkStart w:id="79" w:name="частые-вопросы"/>
-      <w:bookmarkEnd w:id="78"/>
       <w:r>
         <w:rPr>
           <w:rStyle w:val="SectionNumber"/>
@@ -5176,7 +5258,7 @@
         <w:rPr/>
         <w:t xml:space="preserve"> У каждого плана свои — «Настройки графика» на экране проекта (руководство пользователя).</w:t>
       </w:r>
-      <w:bookmarkEnd w:id="79"/>
+      <w:bookmarkEnd w:id="78"/>
     </w:p>
     <w:sectPr>
       <w:footerReference w:type="even" r:id="rId11"/>
@@ -5222,7 +5304,7 @@
         <w:color w:val="8A92A6"/>
         <w:sz w:val="16"/>
       </w:rPr>
-      <w:t xml:space="preserve">Пульс Проекта 0.2.0 · стр. </w:t>
+      <w:t xml:space="preserve">Пульс Проекта 0.2.1 · стр. </w:t>
     </w:r>
     <w:r>
       <w:rPr/>
@@ -5261,7 +5343,7 @@
         <w:color w:val="8A92A6"/>
         <w:sz w:val="16"/>
       </w:rPr>
-      <w:t xml:space="preserve">Пульс Проекта 0.2.0 · стр. </w:t>
+      <w:t xml:space="preserve">Пульс Проекта 0.2.1 · стр. </w:t>
     </w:r>
     <w:r>
       <w:rPr/>

</xml_diff>

<commit_message>
v0.3.1: Jira Server search fixed (validateQuery boolean), connection check runs a real search
- Jira Server/DC rejected validateQuery "warn" with 400: plan issues were marked missing and key
  search found nothing. Key batches use validateQuery false, user JQL is validated by Jira and its
  error is shown; a single rejected key is read via /issue/KEY; missing issues are rechecked after 60 s.
- Connection check: login, /serverInfo version, probe search with the same request as plans.
- legacy-import no longer creates the bootstrap admin (it blocked the 1.0.x import); clearer messages.
- Directions without accessible projects are hidden from employees (API and dashboard).
- Bar labels pick white or black by APCA: white on blue, red, purple, grey and dark bars.
- Deployment guide: running next to По Делу on one VM (Docker subnet, ports, workers); runbook check.
- Test and e2e Jira stubs behave like Jira Server; CI imports 1.0.1 with BOOTSTRAP_ADMIN_PASSWORD set.
</commit_message>
<xml_diff>
--- a/docs/manuals/admin-guide.docx
+++ b/docs/manuals/admin-guide.docx
@@ -23,7 +23,7 @@
       </w:pPr>
       <w:r>
         <w:rPr/>
-        <w:t>Версия 0.3.0</w:t>
+        <w:t>Версия 0.3.1</w:t>
       </w:r>
     </w:p>
     <w:p>
@@ -93,7 +93,7 @@
             </w:rPr>
             <w:fldChar w:fldCharType="separate"/>
           </w:r>
-          <w:hyperlink w:anchor="__RefHeading___Toc1352_2557720853">
+          <w:hyperlink w:anchor="__RefHeading___Toc1357_2237095093">
             <w:r>
               <w:rPr>
                 <w:webHidden/>
@@ -114,7 +114,7 @@
             </w:tabs>
             <w:rPr/>
           </w:pPr>
-          <w:hyperlink w:anchor="__RefHeading___Toc1354_2557720853">
+          <w:hyperlink w:anchor="__RefHeading___Toc1359_2237095093">
             <w:r>
               <w:rPr>
                 <w:webHidden/>
@@ -135,7 +135,7 @@
             </w:tabs>
             <w:rPr/>
           </w:pPr>
-          <w:hyperlink w:anchor="__RefHeading___Toc1356_2557720853">
+          <w:hyperlink w:anchor="__RefHeading___Toc1361_2237095093">
             <w:r>
               <w:rPr>
                 <w:webHidden/>
@@ -156,7 +156,7 @@
             </w:tabs>
             <w:rPr/>
           </w:pPr>
-          <w:hyperlink w:anchor="__RefHeading___Toc1358_2557720853">
+          <w:hyperlink w:anchor="__RefHeading___Toc1363_2237095093">
             <w:r>
               <w:rPr>
                 <w:webHidden/>
@@ -177,7 +177,7 @@
             </w:tabs>
             <w:rPr/>
           </w:pPr>
-          <w:hyperlink w:anchor="__RefHeading___Toc1360_2557720853">
+          <w:hyperlink w:anchor="__RefHeading___Toc1365_2237095093">
             <w:r>
               <w:rPr>
                 <w:webHidden/>
@@ -198,7 +198,7 @@
             </w:tabs>
             <w:rPr/>
           </w:pPr>
-          <w:hyperlink w:anchor="__RefHeading___Toc1362_2557720853">
+          <w:hyperlink w:anchor="__RefHeading___Toc1367_2237095093">
             <w:r>
               <w:rPr>
                 <w:webHidden/>
@@ -219,7 +219,7 @@
             </w:tabs>
             <w:rPr/>
           </w:pPr>
-          <w:hyperlink w:anchor="__RefHeading___Toc1364_2557720853">
+          <w:hyperlink w:anchor="__RefHeading___Toc1369_2237095093">
             <w:r>
               <w:rPr>
                 <w:webHidden/>
@@ -240,7 +240,7 @@
             </w:tabs>
             <w:rPr/>
           </w:pPr>
-          <w:hyperlink w:anchor="__RefHeading___Toc1366_2557720853">
+          <w:hyperlink w:anchor="__RefHeading___Toc1371_2237095093">
             <w:r>
               <w:rPr>
                 <w:webHidden/>
@@ -261,7 +261,7 @@
             </w:tabs>
             <w:rPr/>
           </w:pPr>
-          <w:hyperlink w:anchor="__RefHeading___Toc1368_2557720853">
+          <w:hyperlink w:anchor="__RefHeading___Toc1373_2237095093">
             <w:r>
               <w:rPr>
                 <w:webHidden/>
@@ -282,7 +282,7 @@
             </w:tabs>
             <w:rPr/>
           </w:pPr>
-          <w:hyperlink w:anchor="__RefHeading___Toc1370_2557720853">
+          <w:hyperlink w:anchor="__RefHeading___Toc1375_2237095093">
             <w:r>
               <w:rPr>
                 <w:webHidden/>
@@ -303,7 +303,7 @@
             </w:tabs>
             <w:rPr/>
           </w:pPr>
-          <w:hyperlink w:anchor="__RefHeading___Toc1372_2557720853">
+          <w:hyperlink w:anchor="__RefHeading___Toc1377_2237095093">
             <w:r>
               <w:rPr>
                 <w:webHidden/>
@@ -324,7 +324,7 @@
             </w:tabs>
             <w:rPr/>
           </w:pPr>
-          <w:hyperlink w:anchor="__RefHeading___Toc1374_2557720853">
+          <w:hyperlink w:anchor="__RefHeading___Toc1379_2237095093">
             <w:r>
               <w:rPr>
                 <w:webHidden/>
@@ -345,7 +345,7 @@
             </w:tabs>
             <w:rPr/>
           </w:pPr>
-          <w:hyperlink w:anchor="__RefHeading___Toc1376_2557720853">
+          <w:hyperlink w:anchor="__RefHeading___Toc1381_2237095093">
             <w:r>
               <w:rPr>
                 <w:webHidden/>
@@ -366,7 +366,7 @@
             </w:tabs>
             <w:rPr/>
           </w:pPr>
-          <w:hyperlink w:anchor="__RefHeading___Toc1378_2557720853">
+          <w:hyperlink w:anchor="__RefHeading___Toc1383_2237095093">
             <w:r>
               <w:rPr>
                 <w:webHidden/>
@@ -387,7 +387,7 @@
             </w:tabs>
             <w:rPr/>
           </w:pPr>
-          <w:hyperlink w:anchor="__RefHeading___Toc1380_2557720853">
+          <w:hyperlink w:anchor="__RefHeading___Toc1385_2237095093">
             <w:r>
               <w:rPr>
                 <w:webHidden/>
@@ -408,7 +408,7 @@
             </w:tabs>
             <w:rPr/>
           </w:pPr>
-          <w:hyperlink w:anchor="__RefHeading___Toc1382_2557720853">
+          <w:hyperlink w:anchor="__RefHeading___Toc1387_2237095093">
             <w:r>
               <w:rPr>
                 <w:webHidden/>
@@ -429,7 +429,7 @@
             </w:tabs>
             <w:rPr/>
           </w:pPr>
-          <w:hyperlink w:anchor="__RefHeading___Toc1384_2557720853">
+          <w:hyperlink w:anchor="__RefHeading___Toc1389_2237095093">
             <w:r>
               <w:rPr>
                 <w:webHidden/>
@@ -450,7 +450,7 @@
             </w:tabs>
             <w:rPr/>
           </w:pPr>
-          <w:hyperlink w:anchor="__RefHeading___Toc1386_2557720853">
+          <w:hyperlink w:anchor="__RefHeading___Toc1391_2237095093">
             <w:r>
               <w:rPr>
                 <w:webHidden/>
@@ -471,7 +471,7 @@
             </w:tabs>
             <w:rPr/>
           </w:pPr>
-          <w:hyperlink w:anchor="__RefHeading___Toc1388_2557720853">
+          <w:hyperlink w:anchor="__RefHeading___Toc1393_2237095093">
             <w:r>
               <w:rPr>
                 <w:webHidden/>
@@ -492,7 +492,7 @@
             </w:tabs>
             <w:rPr/>
           </w:pPr>
-          <w:hyperlink w:anchor="__RefHeading___Toc1390_2557720853">
+          <w:hyperlink w:anchor="__RefHeading___Toc1395_2237095093">
             <w:r>
               <w:rPr>
                 <w:webHidden/>
@@ -513,7 +513,7 @@
             </w:tabs>
             <w:rPr/>
           </w:pPr>
-          <w:hyperlink w:anchor="__RefHeading___Toc1392_2557720853">
+          <w:hyperlink w:anchor="__RefHeading___Toc1397_2237095093">
             <w:r>
               <w:rPr>
                 <w:webHidden/>
@@ -534,7 +534,7 @@
             </w:tabs>
             <w:rPr/>
           </w:pPr>
-          <w:hyperlink w:anchor="__RefHeading___Toc1394_2557720853">
+          <w:hyperlink w:anchor="__RefHeading___Toc1399_2237095093">
             <w:r>
               <w:rPr>
                 <w:webHidden/>
@@ -555,7 +555,7 @@
             </w:tabs>
             <w:rPr/>
           </w:pPr>
-          <w:hyperlink w:anchor="__RefHeading___Toc1396_2557720853">
+          <w:hyperlink w:anchor="__RefHeading___Toc1401_2237095093">
             <w:r>
               <w:rPr>
                 <w:webHidden/>
@@ -576,7 +576,7 @@
             </w:tabs>
             <w:rPr/>
           </w:pPr>
-          <w:hyperlink w:anchor="__RefHeading___Toc1398_2557720853">
+          <w:hyperlink w:anchor="__RefHeading___Toc1403_2237095093">
             <w:r>
               <w:rPr>
                 <w:webHidden/>
@@ -597,7 +597,7 @@
             </w:tabs>
             <w:rPr/>
           </w:pPr>
-          <w:hyperlink w:anchor="__RefHeading___Toc1400_2557720853">
+          <w:hyperlink w:anchor="__RefHeading___Toc1405_2237095093">
             <w:r>
               <w:rPr>
                 <w:webHidden/>
@@ -618,7 +618,7 @@
             </w:tabs>
             <w:rPr/>
           </w:pPr>
-          <w:hyperlink w:anchor="__RefHeading___Toc1402_2557720853">
+          <w:hyperlink w:anchor="__RefHeading___Toc1407_2237095093">
             <w:r>
               <w:rPr>
                 <w:webHidden/>
@@ -639,7 +639,7 @@
             </w:tabs>
             <w:rPr/>
           </w:pPr>
-          <w:hyperlink w:anchor="__RefHeading___Toc1404_2557720853">
+          <w:hyperlink w:anchor="__RefHeading___Toc1409_2237095093">
             <w:r>
               <w:rPr>
                 <w:webHidden/>
@@ -660,7 +660,7 @@
             </w:tabs>
             <w:rPr/>
           </w:pPr>
-          <w:hyperlink w:anchor="__RefHeading___Toc1406_2557720853">
+          <w:hyperlink w:anchor="__RefHeading___Toc1411_2237095093">
             <w:r>
               <w:rPr>
                 <w:webHidden/>
@@ -681,7 +681,7 @@
             </w:tabs>
             <w:rPr/>
           </w:pPr>
-          <w:hyperlink w:anchor="__RefHeading___Toc1408_2557720853">
+          <w:hyperlink w:anchor="__RefHeading___Toc1413_2237095093">
             <w:r>
               <w:rPr>
                 <w:webHidden/>
@@ -702,7 +702,7 @@
             </w:tabs>
             <w:rPr/>
           </w:pPr>
-          <w:hyperlink w:anchor="__RefHeading___Toc1410_2557720853">
+          <w:hyperlink w:anchor="__RefHeading___Toc1415_2237095093">
             <w:r>
               <w:rPr>
                 <w:webHidden/>
@@ -723,7 +723,7 @@
             </w:tabs>
             <w:rPr/>
           </w:pPr>
-          <w:hyperlink w:anchor="__RefHeading___Toc1412_2557720853">
+          <w:hyperlink w:anchor="__RefHeading___Toc1417_2237095093">
             <w:r>
               <w:rPr>
                 <w:webHidden/>
@@ -744,7 +744,7 @@
             </w:tabs>
             <w:rPr/>
           </w:pPr>
-          <w:hyperlink w:anchor="__RefHeading___Toc1414_2557720853">
+          <w:hyperlink w:anchor="__RefHeading___Toc1419_2237095093">
             <w:r>
               <w:rPr>
                 <w:webHidden/>
@@ -765,7 +765,7 @@
             </w:tabs>
             <w:rPr/>
           </w:pPr>
-          <w:hyperlink w:anchor="__RefHeading___Toc1416_2557720853">
+          <w:hyperlink w:anchor="__RefHeading___Toc1421_2237095093">
             <w:r>
               <w:rPr>
                 <w:webHidden/>
@@ -786,7 +786,7 @@
             </w:tabs>
             <w:rPr/>
           </w:pPr>
-          <w:hyperlink w:anchor="__RefHeading___Toc1418_2557720853">
+          <w:hyperlink w:anchor="__RefHeading___Toc1423_2237095093">
             <w:r>
               <w:rPr>
                 <w:webHidden/>
@@ -807,7 +807,7 @@
             </w:tabs>
             <w:rPr/>
           </w:pPr>
-          <w:hyperlink w:anchor="__RefHeading___Toc1420_2557720853">
+          <w:hyperlink w:anchor="__RefHeading___Toc1425_2237095093">
             <w:r>
               <w:rPr>
                 <w:webHidden/>
@@ -828,7 +828,7 @@
             </w:tabs>
             <w:rPr/>
           </w:pPr>
-          <w:hyperlink w:anchor="__RefHeading___Toc1422_2557720853">
+          <w:hyperlink w:anchor="__RefHeading___Toc1427_2237095093">
             <w:r>
               <w:rPr>
                 <w:webHidden/>
@@ -849,7 +849,7 @@
             </w:tabs>
             <w:rPr/>
           </w:pPr>
-          <w:hyperlink w:anchor="__RefHeading___Toc1424_2557720853">
+          <w:hyperlink w:anchor="__RefHeading___Toc1429_2237095093">
             <w:r>
               <w:rPr>
                 <w:webHidden/>
@@ -870,7 +870,7 @@
             </w:tabs>
             <w:rPr/>
           </w:pPr>
-          <w:hyperlink w:anchor="__RefHeading___Toc1426_2557720853">
+          <w:hyperlink w:anchor="__RefHeading___Toc1431_2237095093">
             <w:r>
               <w:rPr>
                 <w:webHidden/>
@@ -891,7 +891,7 @@
             </w:tabs>
             <w:rPr/>
           </w:pPr>
-          <w:hyperlink w:anchor="__RefHeading___Toc1428_2557720853">
+          <w:hyperlink w:anchor="__RefHeading___Toc1433_2237095093">
             <w:r>
               <w:rPr>
                 <w:webHidden/>
@@ -912,7 +912,7 @@
             </w:tabs>
             <w:rPr/>
           </w:pPr>
-          <w:hyperlink w:anchor="__RefHeading___Toc1430_2557720853">
+          <w:hyperlink w:anchor="__RefHeading___Toc1435_2237095093">
             <w:r>
               <w:rPr>
                 <w:webHidden/>
@@ -933,7 +933,7 @@
             </w:tabs>
             <w:rPr/>
           </w:pPr>
-          <w:hyperlink w:anchor="__RefHeading___Toc1432_2557720853">
+          <w:hyperlink w:anchor="__RefHeading___Toc1437_2237095093">
             <w:r>
               <w:rPr>
                 <w:webHidden/>
@@ -954,7 +954,7 @@
             </w:tabs>
             <w:rPr/>
           </w:pPr>
-          <w:hyperlink w:anchor="__RefHeading___Toc1434_2557720853">
+          <w:hyperlink w:anchor="__RefHeading___Toc1439_2237095093">
             <w:r>
               <w:rPr>
                 <w:webHidden/>
@@ -979,7 +979,7 @@
         <w:pStyle w:val="Heading1"/>
         <w:rPr/>
       </w:pPr>
-      <w:bookmarkStart w:id="0" w:name="__RefHeading___Toc1352_2557720853"/>
+      <w:bookmarkStart w:id="0" w:name="__RefHeading___Toc1357_2237095093"/>
       <w:bookmarkStart w:id="1" w:name="о-документе"/>
       <w:bookmarkEnd w:id="0"/>
       <w:r>
@@ -1001,7 +1001,7 @@
       </w:pPr>
       <w:r>
         <w:rPr/>
-        <w:t>Руководство описывает администрирование «Пульса Проекта» версии 0.3.0: роли и доступы, сотрудников, направления, реестр изменений, корзину, вход через домен (LDAP / Active Directory) и производственный календарь. Работа с проектами и планами — в «Руководстве пользователя», установка, обновление и резервное копирование — в «Руководстве по развёртыванию».</w:t>
+        <w:t>Руководство описывает администрирование «Пульса Проекта» версии 0.3.1: роли и доступы, сотрудников, направления, реестр изменений, корзину, вход через домен (LDAP / Active Directory) и производственный календарь. Работа с проектами и планами — в «Руководстве пользователя», установка, обновление и резервное копирование — в «Руководстве по развёртыванию».</w:t>
       </w:r>
     </w:p>
     <w:p>
@@ -1021,7 +1021,7 @@
         <w:pStyle w:val="Heading1"/>
         <w:rPr/>
       </w:pPr>
-      <w:bookmarkStart w:id="3" w:name="__RefHeading___Toc1354_2557720853"/>
+      <w:bookmarkStart w:id="3" w:name="__RefHeading___Toc1359_2237095093"/>
       <w:bookmarkStart w:id="4" w:name="роли-и-права"/>
       <w:bookmarkEnd w:id="3"/>
       <w:r>
@@ -1041,7 +1041,7 @@
         <w:pStyle w:val="Heading2"/>
         <w:rPr/>
       </w:pPr>
-      <w:bookmarkStart w:id="5" w:name="__RefHeading___Toc1356_2557720853"/>
+      <w:bookmarkStart w:id="5" w:name="__RefHeading___Toc1361_2237095093"/>
       <w:bookmarkEnd w:id="5"/>
       <w:r>
         <w:rPr>
@@ -1455,7 +1455,7 @@
         <w:pStyle w:val="Heading2"/>
         <w:rPr/>
       </w:pPr>
-      <w:bookmarkStart w:id="7" w:name="__RefHeading___Toc1358_2557720853"/>
+      <w:bookmarkStart w:id="7" w:name="__RefHeading___Toc1363_2237095093"/>
       <w:bookmarkEnd w:id="7"/>
       <w:r>
         <w:rPr>
@@ -1788,7 +1788,7 @@
         <w:pStyle w:val="Heading2"/>
         <w:rPr/>
       </w:pPr>
-      <w:bookmarkStart w:id="8" w:name="__RefHeading___Toc1360_2557720853"/>
+      <w:bookmarkStart w:id="8" w:name="__RefHeading___Toc1365_2237095093"/>
       <w:bookmarkStart w:id="9" w:name="как-считается-доступ"/>
       <w:bookmarkEnd w:id="8"/>
       <w:r>
@@ -1904,7 +1904,7 @@
         <w:pStyle w:val="Heading2"/>
         <w:rPr/>
       </w:pPr>
-      <w:bookmarkStart w:id="11" w:name="__RefHeading___Toc1362_2557720853"/>
+      <w:bookmarkStart w:id="11" w:name="__RefHeading___Toc1367_2237095093"/>
       <w:bookmarkStart w:id="12" w:name="защита-от-ошибок"/>
       <w:bookmarkEnd w:id="11"/>
       <w:r>
@@ -1984,7 +1984,7 @@
         <w:pStyle w:val="Heading1"/>
         <w:rPr/>
       </w:pPr>
-      <w:bookmarkStart w:id="15" w:name="__RefHeading___Toc1364_2557720853"/>
+      <w:bookmarkStart w:id="15" w:name="__RefHeading___Toc1369_2237095093"/>
       <w:bookmarkStart w:id="16" w:name="первичная-настройка"/>
       <w:bookmarkEnd w:id="15"/>
       <w:r>
@@ -2004,7 +2004,7 @@
         <w:pStyle w:val="Heading2"/>
         <w:rPr/>
       </w:pPr>
-      <w:bookmarkStart w:id="17" w:name="__RefHeading___Toc1366_2557720853"/>
+      <w:bookmarkStart w:id="17" w:name="__RefHeading___Toc1371_2237095093"/>
       <w:bookmarkStart w:id="18" w:name="после-перехода-с-1.0.1"/>
       <w:bookmarkEnd w:id="17"/>
       <w:r>
@@ -2130,7 +2130,7 @@
         <w:pStyle w:val="Heading2"/>
         <w:rPr/>
       </w:pPr>
-      <w:bookmarkStart w:id="19" w:name="__RefHeading___Toc1368_2557720853"/>
+      <w:bookmarkStart w:id="19" w:name="__RefHeading___Toc1373_2237095093"/>
       <w:bookmarkStart w:id="20" w:name="новая-установка"/>
       <w:bookmarkEnd w:id="19"/>
       <w:r>
@@ -2245,7 +2245,7 @@
         <w:pStyle w:val="Heading1"/>
         <w:rPr/>
       </w:pPr>
-      <w:bookmarkStart w:id="21" w:name="__RefHeading___Toc1370_2557720853"/>
+      <w:bookmarkStart w:id="21" w:name="__RefHeading___Toc1375_2237095093"/>
       <w:bookmarkStart w:id="22" w:name="сотрудники"/>
       <w:bookmarkEnd w:id="21"/>
       <w:r>
@@ -2265,7 +2265,7 @@
         <w:pStyle w:val="Heading2"/>
         <w:rPr/>
       </w:pPr>
-      <w:bookmarkStart w:id="23" w:name="__RefHeading___Toc1372_2557720853"/>
+      <w:bookmarkStart w:id="23" w:name="__RefHeading___Toc1377_2237095093"/>
       <w:bookmarkStart w:id="24" w:name="список"/>
       <w:bookmarkEnd w:id="23"/>
       <w:r>
@@ -2373,7 +2373,7 @@
         <w:pStyle w:val="Heading2"/>
         <w:rPr/>
       </w:pPr>
-      <w:bookmarkStart w:id="25" w:name="__RefHeading___Toc1374_2557720853"/>
+      <w:bookmarkStart w:id="25" w:name="__RefHeading___Toc1379_2237095093"/>
       <w:bookmarkStart w:id="26" w:name="добавление-и-изменение"/>
       <w:bookmarkEnd w:id="25"/>
       <w:r>
@@ -2506,7 +2506,7 @@
         <w:pStyle w:val="Heading2"/>
         <w:rPr/>
       </w:pPr>
-      <w:bookmarkStart w:id="27" w:name="__RefHeading___Toc1376_2557720853"/>
+      <w:bookmarkStart w:id="27" w:name="__RefHeading___Toc1381_2237095093"/>
       <w:bookmarkStart w:id="28" w:name="отключение-и-удаление"/>
       <w:bookmarkEnd w:id="27"/>
       <w:r>
@@ -2570,7 +2570,7 @@
         <w:pStyle w:val="Heading1"/>
         <w:rPr/>
       </w:pPr>
-      <w:bookmarkStart w:id="29" w:name="__RefHeading___Toc1378_2557720853"/>
+      <w:bookmarkStart w:id="29" w:name="__RefHeading___Toc1383_2237095093"/>
       <w:bookmarkStart w:id="30" w:name="структура-компании"/>
       <w:bookmarkEnd w:id="29"/>
       <w:r>
@@ -2667,7 +2667,7 @@
         <w:pStyle w:val="Heading2"/>
         <w:rPr/>
       </w:pPr>
-      <w:bookmarkStart w:id="31" w:name="__RefHeading___Toc1380_2557720853"/>
+      <w:bookmarkStart w:id="31" w:name="__RefHeading___Toc1385_2237095093"/>
       <w:bookmarkStart w:id="32" w:name="подразделения"/>
       <w:bookmarkEnd w:id="31"/>
       <w:r>
@@ -2802,7 +2802,7 @@
         <w:pStyle w:val="Heading2"/>
         <w:rPr/>
       </w:pPr>
-      <w:bookmarkStart w:id="33" w:name="__RefHeading___Toc1382_2557720853"/>
+      <w:bookmarkStart w:id="33" w:name="__RefHeading___Toc1387_2237095093"/>
       <w:bookmarkStart w:id="34" w:name="руководители-и-подчинение"/>
       <w:bookmarkEnd w:id="33"/>
       <w:r>
@@ -2897,7 +2897,7 @@
         <w:pStyle w:val="Heading2"/>
         <w:rPr/>
       </w:pPr>
-      <w:bookmarkStart w:id="36" w:name="__RefHeading___Toc1384_2557720853"/>
+      <w:bookmarkStart w:id="36" w:name="__RefHeading___Toc1389_2237095093"/>
       <w:bookmarkStart w:id="37" w:name="импорт-и-экспорт"/>
       <w:bookmarkEnd w:id="36"/>
       <w:r>
@@ -3731,7 +3731,7 @@
         <w:pStyle w:val="Heading1"/>
         <w:rPr/>
       </w:pPr>
-      <w:bookmarkStart w:id="38" w:name="__RefHeading___Toc1386_2557720853"/>
+      <w:bookmarkStart w:id="38" w:name="__RefHeading___Toc1391_2237095093"/>
       <w:bookmarkStart w:id="39" w:name="направления"/>
       <w:bookmarkEnd w:id="38"/>
       <w:r>
@@ -3849,7 +3849,7 @@
         <w:pStyle w:val="Heading1"/>
         <w:rPr/>
       </w:pPr>
-      <w:bookmarkStart w:id="40" w:name="__RefHeading___Toc1388_2557720853"/>
+      <w:bookmarkStart w:id="40" w:name="__RefHeading___Toc1393_2237095093"/>
       <w:bookmarkStart w:id="41" w:name="доступы"/>
       <w:bookmarkEnd w:id="40"/>
       <w:r>
@@ -3879,7 +3879,7 @@
         <w:pStyle w:val="Heading2"/>
         <w:rPr/>
       </w:pPr>
-      <w:bookmarkStart w:id="42" w:name="__RefHeading___Toc1390_2557720853"/>
+      <w:bookmarkStart w:id="42" w:name="__RefHeading___Toc1395_2237095093"/>
       <w:bookmarkStart w:id="43" w:name="выдать-доступ"/>
       <w:bookmarkEnd w:id="42"/>
       <w:r>
@@ -4063,7 +4063,7 @@
         <w:pStyle w:val="Heading2"/>
         <w:rPr/>
       </w:pPr>
-      <w:bookmarkStart w:id="45" w:name="__RefHeading___Toc1392_2557720853"/>
+      <w:bookmarkStart w:id="45" w:name="__RefHeading___Toc1397_2237095093"/>
       <w:bookmarkStart w:id="46" w:name="правила"/>
       <w:bookmarkEnd w:id="45"/>
       <w:r>
@@ -4184,7 +4184,7 @@
         <w:pStyle w:val="Heading2"/>
         <w:rPr/>
       </w:pPr>
-      <w:bookmarkStart w:id="48" w:name="__RefHeading___Toc1394_2557720853"/>
+      <w:bookmarkStart w:id="48" w:name="__RefHeading___Toc1399_2237095093"/>
       <w:bookmarkStart w:id="49" w:name="кто-что-видит"/>
       <w:bookmarkEnd w:id="48"/>
       <w:r>
@@ -4274,7 +4274,7 @@
         <w:pStyle w:val="Heading1"/>
         <w:rPr/>
       </w:pPr>
-      <w:bookmarkStart w:id="52" w:name="__RefHeading___Toc1396_2557720853"/>
+      <w:bookmarkStart w:id="52" w:name="__RefHeading___Toc1401_2237095093"/>
       <w:bookmarkStart w:id="53" w:name="реестр-изменений"/>
       <w:bookmarkEnd w:id="52"/>
       <w:r>
@@ -4392,7 +4392,7 @@
         <w:pStyle w:val="Heading1"/>
         <w:rPr/>
       </w:pPr>
-      <w:bookmarkStart w:id="54" w:name="__RefHeading___Toc1398_2557720853"/>
+      <w:bookmarkStart w:id="54" w:name="__RefHeading___Toc1403_2237095093"/>
       <w:bookmarkStart w:id="55" w:name="корзина"/>
       <w:bookmarkEnd w:id="54"/>
       <w:r>
@@ -4534,7 +4534,7 @@
         <w:pStyle w:val="Heading1"/>
         <w:rPr/>
       </w:pPr>
-      <w:bookmarkStart w:id="57" w:name="__RefHeading___Toc1400_2557720853"/>
+      <w:bookmarkStart w:id="57" w:name="__RefHeading___Toc1405_2237095093"/>
       <w:bookmarkStart w:id="58" w:name="интеграции-jira"/>
       <w:bookmarkEnd w:id="57"/>
       <w:r>
@@ -4762,7 +4762,7 @@
       </w:r>
       <w:r>
         <w:rPr/>
-        <w:t xml:space="preserve"> → «Соединение установлено: » → </w:t>
+        <w:t xml:space="preserve"> → «Соединение установлено:  · Jira Server 8.20.10 · поиск задач работает» → </w:t>
       </w:r>
       <w:r>
         <w:rPr>
@@ -4773,7 +4773,7 @@
       </w:r>
       <w:r>
         <w:rPr/>
-        <w:t>.</w:t>
+        <w:t>. Проверка входит в Jira, узнаёт её версию и выполняет поиск задач тем же запросом, каким читаются задачи планов: если вход удался, а поиск нет, проверка скажет об этом с причиной от Jira.</w:t>
       </w:r>
     </w:p>
     <w:p>
@@ -4809,7 +4809,7 @@
         <w:pStyle w:val="Heading1"/>
         <w:rPr/>
       </w:pPr>
-      <w:bookmarkStart w:id="59" w:name="__RefHeading___Toc1402_2557720853"/>
+      <w:bookmarkStart w:id="59" w:name="__RefHeading___Toc1407_2237095093"/>
       <w:bookmarkStart w:id="60" w:name="вход-через-домен"/>
       <w:bookmarkEnd w:id="59"/>
       <w:r>
@@ -5909,7 +5909,7 @@
         <w:pStyle w:val="Heading1"/>
         <w:rPr/>
       </w:pPr>
-      <w:bookmarkStart w:id="62" w:name="__RefHeading___Toc1404_2557720853"/>
+      <w:bookmarkStart w:id="62" w:name="__RefHeading___Toc1409_2237095093"/>
       <w:bookmarkStart w:id="63" w:name="производственный-календарь"/>
       <w:bookmarkEnd w:id="62"/>
       <w:r>
@@ -6074,7 +6074,7 @@
         <w:pStyle w:val="Heading1"/>
         <w:rPr/>
       </w:pPr>
-      <w:bookmarkStart w:id="64" w:name="__RefHeading___Toc1406_2557720853"/>
+      <w:bookmarkStart w:id="64" w:name="__RefHeading___Toc1411_2237095093"/>
       <w:bookmarkStart w:id="65" w:name="работа-сервиса"/>
       <w:bookmarkEnd w:id="64"/>
       <w:r>
@@ -6220,7 +6220,7 @@
         <w:pStyle w:val="Heading1"/>
         <w:rPr/>
       </w:pPr>
-      <w:bookmarkStart w:id="66" w:name="__RefHeading___Toc1408_2557720853"/>
+      <w:bookmarkStart w:id="66" w:name="__RefHeading___Toc1413_2237095093"/>
       <w:bookmarkStart w:id="67" w:name="сценарии-администратора"/>
       <w:bookmarkEnd w:id="66"/>
       <w:r>
@@ -6240,7 +6240,7 @@
         <w:pStyle w:val="Heading2"/>
         <w:rPr/>
       </w:pPr>
-      <w:bookmarkStart w:id="68" w:name="__RefHeading___Toc1410_2557720853"/>
+      <w:bookmarkStart w:id="68" w:name="__RefHeading___Toc1415_2237095093"/>
       <w:bookmarkStart w:id="69" w:name="X525cf896d0e0da260fae1e7259530962a7d5ac1"/>
       <w:bookmarkEnd w:id="68"/>
       <w:r>
@@ -6318,7 +6318,7 @@
         <w:pStyle w:val="Heading2"/>
         <w:rPr/>
       </w:pPr>
-      <w:bookmarkStart w:id="71" w:name="__RefHeading___Toc1412_2557720853"/>
+      <w:bookmarkStart w:id="71" w:name="__RefHeading___Toc1417_2237095093"/>
       <w:bookmarkStart w:id="72" w:name="сценарий-а2.-увольнение"/>
       <w:bookmarkEnd w:id="71"/>
       <w:r>
@@ -6400,7 +6400,7 @@
         <w:pStyle w:val="Heading2"/>
         <w:rPr/>
       </w:pPr>
-      <w:bookmarkStart w:id="74" w:name="__RefHeading___Toc1414_2557720853"/>
+      <w:bookmarkStart w:id="74" w:name="__RefHeading___Toc1419_2237095093"/>
       <w:bookmarkStart w:id="75" w:name="X40b3630711ad101350b0dd1e981711065e8bd89"/>
       <w:bookmarkEnd w:id="74"/>
       <w:r>
@@ -6432,7 +6432,7 @@
         <w:pStyle w:val="Heading2"/>
         <w:rPr/>
       </w:pPr>
-      <w:bookmarkStart w:id="77" w:name="__RefHeading___Toc1416_2557720853"/>
+      <w:bookmarkStart w:id="77" w:name="__RefHeading___Toc1421_2237095093"/>
       <w:bookmarkStart w:id="78" w:name="X47b085d6f5d4ae9e2a209044082e45befec994f"/>
       <w:bookmarkEnd w:id="77"/>
       <w:r>
@@ -6470,7 +6470,7 @@
         <w:pStyle w:val="Heading2"/>
         <w:rPr/>
       </w:pPr>
-      <w:bookmarkStart w:id="79" w:name="__RefHeading___Toc1418_2557720853"/>
+      <w:bookmarkStart w:id="79" w:name="__RefHeading___Toc1423_2237095093"/>
       <w:bookmarkStart w:id="80" w:name="Xe1ad479a47bf9d896db09fa985b7ceb589233e6"/>
       <w:bookmarkEnd w:id="79"/>
       <w:r>
@@ -6541,7 +6541,7 @@
         <w:pStyle w:val="Heading2"/>
         <w:rPr/>
       </w:pPr>
-      <w:bookmarkStart w:id="81" w:name="__RefHeading___Toc1420_2557720853"/>
+      <w:bookmarkStart w:id="81" w:name="__RefHeading___Toc1425_2237095093"/>
       <w:bookmarkStart w:id="82" w:name="сценарий-а6.-сотрудник-забыл-пароль"/>
       <w:bookmarkEnd w:id="81"/>
       <w:r>
@@ -6594,7 +6594,7 @@
         <w:pStyle w:val="Heading2"/>
         <w:rPr/>
       </w:pPr>
-      <w:bookmarkStart w:id="83" w:name="__RefHeading___Toc1422_2557720853"/>
+      <w:bookmarkStart w:id="83" w:name="__RefHeading___Toc1427_2237095093"/>
       <w:bookmarkStart w:id="84" w:name="сценарий-а7.-переход-на-вход-через-домен"/>
       <w:bookmarkEnd w:id="83"/>
       <w:r>
@@ -6707,7 +6707,7 @@
         <w:pStyle w:val="Heading2"/>
         <w:rPr/>
       </w:pPr>
-      <w:bookmarkStart w:id="85" w:name="__RefHeading___Toc1424_2557720853"/>
+      <w:bookmarkStart w:id="85" w:name="__RefHeading___Toc1429_2237095093"/>
       <w:bookmarkStart w:id="86" w:name="сценарий-а8.-кто-удалил-строку-в-плане"/>
       <w:bookmarkEnd w:id="85"/>
       <w:r>
@@ -6760,7 +6760,7 @@
         <w:pStyle w:val="Heading2"/>
         <w:rPr/>
       </w:pPr>
-      <w:bookmarkStart w:id="87" w:name="__RefHeading___Toc1426_2557720853"/>
+      <w:bookmarkStart w:id="87" w:name="__RefHeading___Toc1431_2237095093"/>
       <w:bookmarkStart w:id="88" w:name="X387a919fb1df514141b31fa3d13f82a51b424f4"/>
       <w:bookmarkEnd w:id="87"/>
       <w:r>
@@ -6900,7 +6900,7 @@
         <w:pStyle w:val="Heading2"/>
         <w:rPr/>
       </w:pPr>
-      <w:bookmarkStart w:id="90" w:name="__RefHeading___Toc1428_2557720853"/>
+      <w:bookmarkStart w:id="90" w:name="__RefHeading___Toc1433_2237095093"/>
       <w:bookmarkStart w:id="91" w:name="Xa559ee2f1a0fdc2b80a1f0cd131cb58a0b5e8f8"/>
       <w:bookmarkEnd w:id="90"/>
       <w:r>
@@ -6975,7 +6975,7 @@
         <w:pStyle w:val="Heading2"/>
         <w:rPr/>
       </w:pPr>
-      <w:bookmarkStart w:id="93" w:name="__RefHeading___Toc1430_2557720853"/>
+      <w:bookmarkStart w:id="93" w:name="__RefHeading___Toc1435_2237095093"/>
       <w:bookmarkStart w:id="94" w:name="сценарий-а11.-подключение-jira"/>
       <w:bookmarkEnd w:id="93"/>
       <w:r>
@@ -7106,7 +7106,7 @@
         <w:pStyle w:val="Heading1"/>
         <w:rPr/>
       </w:pPr>
-      <w:bookmarkStart w:id="95" w:name="__RefHeading___Toc1432_2557720853"/>
+      <w:bookmarkStart w:id="95" w:name="__RefHeading___Toc1437_2237095093"/>
       <w:bookmarkStart w:id="96" w:name="рекомендации-по-безопасности"/>
       <w:bookmarkEnd w:id="95"/>
       <w:r>
@@ -7219,7 +7219,7 @@
         <w:pStyle w:val="Heading1"/>
         <w:rPr/>
       </w:pPr>
-      <w:bookmarkStart w:id="97" w:name="__RefHeading___Toc1434_2557720853"/>
+      <w:bookmarkStart w:id="97" w:name="__RefHeading___Toc1439_2237095093"/>
       <w:bookmarkStart w:id="98" w:name="частые-вопросы"/>
       <w:bookmarkEnd w:id="97"/>
       <w:r>
@@ -7370,7 +7370,7 @@
         <w:color w:val="8A92A6"/>
         <w:sz w:val="16"/>
       </w:rPr>
-      <w:t xml:space="preserve">Пульс Проекта 0.3.0 · стр. </w:t>
+      <w:t xml:space="preserve">Пульс Проекта 0.3.1 · стр. </w:t>
     </w:r>
     <w:r>
       <w:rPr/>
@@ -7409,7 +7409,7 @@
         <w:color w:val="8A92A6"/>
         <w:sz w:val="16"/>
       </w:rPr>
-      <w:t xml:space="preserve">Пульс Проекта 0.3.0 · стр. </w:t>
+      <w:t xml:space="preserve">Пульс Проекта 0.3.1 · стр. </w:t>
     </w:r>
     <w:r>
       <w:rPr/>

</xml_diff>